<commit_message>
26.10 - Working on the task 1 and task 3
</commit_message>
<xml_diff>
--- a/CA1-Stats for Data Analytics _with_AI_declaration.docx
+++ b/CA1-Stats for Data Analytics _with_AI_declaration.docx
@@ -4129,13 +4129,13 @@
               </w:rPr>
               <w:instrText xml:space="preserve"> PAGEREF _Toc243746803 \h </w:instrText>
             </w:r>
-            <w:r>
-              <w:rPr>
-                <w:noProof/>
-                <w:webHidden/>
-              </w:rPr>
-            </w:r>
           </w:ins>
+          <w:r>
+            <w:rPr>
+              <w:noProof/>
+              <w:webHidden/>
+            </w:rPr>
+          </w:r>
           <w:r>
             <w:rPr>
               <w:noProof/>
@@ -4252,13 +4252,13 @@
               </w:rPr>
               <w:instrText xml:space="preserve"> PAGEREF _Toc243746804 \h </w:instrText>
             </w:r>
-            <w:r>
-              <w:rPr>
-                <w:noProof/>
-                <w:webHidden/>
-              </w:rPr>
-            </w:r>
           </w:ins>
+          <w:r>
+            <w:rPr>
+              <w:noProof/>
+              <w:webHidden/>
+            </w:rPr>
+          </w:r>
           <w:r>
             <w:rPr>
               <w:noProof/>
@@ -4375,13 +4375,13 @@
               </w:rPr>
               <w:instrText xml:space="preserve"> PAGEREF _Toc243746805 \h </w:instrText>
             </w:r>
-            <w:r>
-              <w:rPr>
-                <w:noProof/>
-                <w:webHidden/>
-              </w:rPr>
-            </w:r>
           </w:ins>
+          <w:r>
+            <w:rPr>
+              <w:noProof/>
+              <w:webHidden/>
+            </w:rPr>
+          </w:r>
           <w:r>
             <w:rPr>
               <w:noProof/>
@@ -4498,13 +4498,13 @@
               </w:rPr>
               <w:instrText xml:space="preserve"> PAGEREF _Toc243746806 \h </w:instrText>
             </w:r>
-            <w:r>
-              <w:rPr>
-                <w:noProof/>
-                <w:webHidden/>
-              </w:rPr>
-            </w:r>
           </w:ins>
+          <w:r>
+            <w:rPr>
+              <w:noProof/>
+              <w:webHidden/>
+            </w:rPr>
+          </w:r>
           <w:r>
             <w:rPr>
               <w:noProof/>
@@ -4555,7 +4555,6 @@
           <w:del w:id="249" w:author="Eduardo Flach" w:date="2026-10-23T09:26:00Z">
             <w:r>
               <w:rPr>
-                <w:noProof/>
                 <w:rPrChange w:id="250" w:author="Eduardo Flach" w:date="2026-10-23T09:26:00Z">
                   <w:rPr>
                     <w:rStyle w:val="Hyperlink"/>
@@ -4597,7 +4596,6 @@
           <w:del w:id="252" w:author="Eduardo Flach" w:date="2026-10-23T09:26:00Z">
             <w:r>
               <w:rPr>
-                <w:noProof/>
                 <w:rPrChange w:id="253" w:author="Eduardo Flach" w:date="2026-10-23T09:26:00Z">
                   <w:rPr>
                     <w:rStyle w:val="Hyperlink"/>
@@ -4642,7 +4640,6 @@
           <w:del w:id="255" w:author="Eduardo Flach" w:date="2026-10-23T09:26:00Z">
             <w:r>
               <w:rPr>
-                <w:noProof/>
                 <w:rPrChange w:id="256" w:author="Eduardo Flach" w:date="2026-10-23T09:26:00Z">
                   <w:rPr>
                     <w:rStyle w:val="Hyperlink"/>
@@ -4687,7 +4684,6 @@
           <w:del w:id="258" w:author="Eduardo Flach" w:date="2026-10-23T09:26:00Z">
             <w:r>
               <w:rPr>
-                <w:noProof/>
                 <w:rPrChange w:id="259" w:author="Eduardo Flach" w:date="2026-10-23T09:26:00Z">
                   <w:rPr>
                     <w:rStyle w:val="Hyperlink"/>
@@ -4732,7 +4728,6 @@
           <w:del w:id="261" w:author="Eduardo Flach" w:date="2026-10-23T09:26:00Z">
             <w:r>
               <w:rPr>
-                <w:noProof/>
                 <w:rPrChange w:id="262" w:author="Eduardo Flach" w:date="2026-10-23T09:26:00Z">
                   <w:rPr>
                     <w:rStyle w:val="Hyperlink"/>
@@ -4771,7 +4766,6 @@
           <w:del w:id="264" w:author="Eduardo Flach" w:date="2026-10-23T09:26:00Z">
             <w:r>
               <w:rPr>
-                <w:noProof/>
                 <w:rPrChange w:id="265" w:author="Eduardo Flach" w:date="2026-10-23T09:26:00Z">
                   <w:rPr>
                     <w:rStyle w:val="Hyperlink"/>
@@ -4816,7 +4810,6 @@
           <w:del w:id="267" w:author="Eduardo Flach" w:date="2026-10-23T09:26:00Z">
             <w:r>
               <w:rPr>
-                <w:noProof/>
                 <w:rPrChange w:id="268" w:author="Eduardo Flach" w:date="2026-10-23T09:26:00Z">
                   <w:rPr>
                     <w:rStyle w:val="Hyperlink"/>
@@ -4855,7 +4848,6 @@
           <w:del w:id="270" w:author="Eduardo Flach" w:date="2026-10-23T09:26:00Z">
             <w:r>
               <w:rPr>
-                <w:noProof/>
                 <w:rPrChange w:id="271" w:author="Eduardo Flach" w:date="2026-10-23T09:26:00Z">
                   <w:rPr>
                     <w:rStyle w:val="Hyperlink"/>
@@ -4894,7 +4886,6 @@
           <w:del w:id="273" w:author="Eduardo Flach" w:date="2026-10-23T09:26:00Z">
             <w:r>
               <w:rPr>
-                <w:noProof/>
                 <w:rPrChange w:id="274" w:author="Eduardo Flach" w:date="2026-10-23T09:26:00Z">
                   <w:rPr>
                     <w:rStyle w:val="Hyperlink"/>
@@ -4939,7 +4930,6 @@
           <w:del w:id="276" w:author="Eduardo Flach" w:date="2026-10-23T09:26:00Z">
             <w:r>
               <w:rPr>
-                <w:noProof/>
                 <w:rPrChange w:id="277" w:author="Eduardo Flach" w:date="2026-10-23T09:26:00Z">
                   <w:rPr>
                     <w:rStyle w:val="Hyperlink"/>
@@ -4984,7 +4974,6 @@
           <w:del w:id="279" w:author="Eduardo Flach" w:date="2026-10-23T09:26:00Z">
             <w:r>
               <w:rPr>
-                <w:noProof/>
                 <w:rPrChange w:id="280" w:author="Eduardo Flach" w:date="2026-10-23T09:26:00Z">
                   <w:rPr>
                     <w:rStyle w:val="Hyperlink"/>
@@ -5029,7 +5018,6 @@
           <w:del w:id="282" w:author="Eduardo Flach" w:date="2026-10-23T09:26:00Z">
             <w:r>
               <w:rPr>
-                <w:noProof/>
                 <w:rPrChange w:id="283" w:author="Eduardo Flach" w:date="2026-10-23T09:26:00Z">
                   <w:rPr>
                     <w:rStyle w:val="Hyperlink"/>
@@ -5074,7 +5062,6 @@
           <w:del w:id="285" w:author="Eduardo Flach" w:date="2026-10-23T09:26:00Z">
             <w:r>
               <w:rPr>
-                <w:noProof/>
                 <w:rPrChange w:id="286" w:author="Eduardo Flach" w:date="2026-10-23T09:26:00Z">
                   <w:rPr>
                     <w:rStyle w:val="Hyperlink"/>
@@ -5119,7 +5106,6 @@
           <w:del w:id="288" w:author="Eduardo Flach" w:date="2026-10-23T09:26:00Z">
             <w:r>
               <w:rPr>
-                <w:noProof/>
                 <w:rPrChange w:id="289" w:author="Eduardo Flach" w:date="2026-10-23T09:26:00Z">
                   <w:rPr>
                     <w:rStyle w:val="Hyperlink"/>
@@ -5219,10 +5205,7 @@
         <w:t xml:space="preserve">available at UCI repository named </w:t>
       </w:r>
       <w:r>
-        <w:t>“</w:t>
-      </w:r>
-      <w:r>
-        <w:t xml:space="preserve">Estimation of Obesity Levels Based </w:t>
+        <w:t xml:space="preserve">“Estimation of Obesity Levels Based </w:t>
       </w:r>
       <w:proofErr w:type="gramStart"/>
       <w:r>
@@ -5230,10 +5213,7 @@
       </w:r>
       <w:proofErr w:type="gramEnd"/>
       <w:r>
-        <w:t xml:space="preserve"> Eating Habits and Physical Condition</w:t>
-      </w:r>
-      <w:r>
-        <w:t>”</w:t>
+        <w:t xml:space="preserve"> Eating Habits and Physical Condition”</w:t>
       </w:r>
       <w:r>
         <w:t xml:space="preserve">. It contains 16 features, including categorical and numerical values. It contains 2111 instances but not all off them will be used in this assignment. </w:t>
@@ -5381,10 +5361,7 @@
       </w:r>
       <w:proofErr w:type="spellEnd"/>
       <w:r>
-        <w:t xml:space="preserve">” </w:t>
-      </w:r>
-      <w:r>
-        <w:t>excluding the data generating by SMOTE</w:t>
+        <w:t>” excluding the data generating by SMOTE</w:t>
       </w:r>
       <w:r>
         <w:t xml:space="preserve"> as below</w:t>
@@ -5479,10 +5456,7 @@
         <w:t xml:space="preserve">” there are </w:t>
       </w:r>
       <w:r>
-        <w:t>3 different possible answers: “</w:t>
-      </w:r>
-      <w:r>
-        <w:t xml:space="preserve">Less than a </w:t>
+        <w:t xml:space="preserve">3 different possible answers: “Less than a </w:t>
       </w:r>
       <w:proofErr w:type="spellStart"/>
       <w:r>
@@ -5490,48 +5464,801 @@
       </w:r>
       <w:proofErr w:type="spellEnd"/>
       <w:r>
-        <w:t>”, “</w:t>
-      </w:r>
-      <w:r>
-        <w:t>Between 1 and 2 L</w:t>
-      </w:r>
-      <w:r>
-        <w:t>” and “</w:t>
-      </w:r>
-      <w:r>
-        <w:t>More than 2</w:t>
+        <w:t>”, “Between 1 and 2 L” and “More than 2 L”. These 3 different kinds of possibilities were encoded as “1”, “2” and “3”. The author didn’t explain why the data was kept like that.</w:t>
+      </w:r>
+    </w:p>
+    <w:p>
+      <w:pPr>
+        <w:ind w:firstLine="720"/>
+      </w:pPr>
+      <w:r>
+        <w:t xml:space="preserve">In the next step I explored some information for the continuous value using the describe function as below: </w:t>
+      </w:r>
+    </w:p>
+    <w:p>
+      <w:pPr>
+        <w:ind w:firstLine="720"/>
+      </w:pPr>
+      <w:r>
+        <w:rPr>
+          <w:noProof/>
+        </w:rPr>
+        <w:drawing>
+          <wp:inline distT="0" distB="0" distL="0" distR="0" wp14:anchorId="5EB58AAC" wp14:editId="6FFEB3F8">
+            <wp:extent cx="2221869" cy="2072640"/>
+            <wp:effectExtent l="0" t="0" r="6985" b="3810"/>
+            <wp:docPr id="1" name="Imagem 1"/>
+            <wp:cNvGraphicFramePr>
+              <a:graphicFrameLocks xmlns:a="http://schemas.openxmlformats.org/drawingml/2006/main" noChangeAspect="1"/>
+            </wp:cNvGraphicFramePr>
+            <a:graphic xmlns:a="http://schemas.openxmlformats.org/drawingml/2006/main">
+              <a:graphicData uri="http://schemas.openxmlformats.org/drawingml/2006/picture">
+                <pic:pic xmlns:pic="http://schemas.openxmlformats.org/drawingml/2006/picture">
+                  <pic:nvPicPr>
+                    <pic:cNvPr id="1" name=""/>
+                    <pic:cNvPicPr/>
+                  </pic:nvPicPr>
+                  <pic:blipFill>
+                    <a:blip r:embed="rId15"/>
+                    <a:stretch>
+                      <a:fillRect/>
+                    </a:stretch>
+                  </pic:blipFill>
+                  <pic:spPr>
+                    <a:xfrm>
+                      <a:off x="0" y="0"/>
+                      <a:ext cx="2230967" cy="2081127"/>
+                    </a:xfrm>
+                    <a:prstGeom prst="rect">
+                      <a:avLst/>
+                    </a:prstGeom>
+                  </pic:spPr>
+                </pic:pic>
+              </a:graphicData>
+            </a:graphic>
+          </wp:inline>
+        </w:drawing>
+      </w:r>
+    </w:p>
+    <w:p>
+      <w:pPr>
+        <w:ind w:firstLine="720"/>
+      </w:pPr>
+      <w:r>
+        <w:lastRenderedPageBreak/>
+        <w:t xml:space="preserve">In the next step, </w:t>
+      </w:r>
+      <w:r>
+        <w:t xml:space="preserve">it was calculated the mean = </w:t>
+      </w:r>
+      <w:r>
+        <w:t>69.5</w:t>
+      </w:r>
+      <w:r>
+        <w:t xml:space="preserve">7, medium = 67 and mode = 60 for the “Weight” feature. </w:t>
+      </w:r>
+    </w:p>
+    <w:p>
+      <w:pPr>
+        <w:ind w:firstLine="720"/>
+      </w:pPr>
+      <w:r>
+        <w:t xml:space="preserve">After that it was plotted a graph showing the 498 data. Just seeing the </w:t>
+      </w:r>
+      <w:r>
+        <w:t>graph,</w:t>
+      </w:r>
+      <w:r>
+        <w:t xml:space="preserve"> it</w:t>
+      </w:r>
+      <w:r>
+        <w:t xml:space="preserve"> looks like a bell shape but skewed to the left. Another perception is that the data goes up to 160kg, probably containing outliers.</w:t>
+      </w:r>
+    </w:p>
+    <w:p>
+      <w:pPr>
+        <w:ind w:firstLine="720"/>
+      </w:pPr>
+    </w:p>
+    <w:p>
+      <w:pPr>
+        <w:ind w:firstLine="720"/>
+      </w:pPr>
+      <w:r>
+        <w:drawing>
+          <wp:inline distT="0" distB="0" distL="0" distR="0" wp14:anchorId="69A28B2D" wp14:editId="30418174">
+            <wp:extent cx="5731510" cy="4394200"/>
+            <wp:effectExtent l="0" t="0" r="2540" b="6350"/>
+            <wp:docPr id="2" name="Imagem 2"/>
+            <wp:cNvGraphicFramePr>
+              <a:graphicFrameLocks xmlns:a="http://schemas.openxmlformats.org/drawingml/2006/main" noChangeAspect="1"/>
+            </wp:cNvGraphicFramePr>
+            <a:graphic xmlns:a="http://schemas.openxmlformats.org/drawingml/2006/main">
+              <a:graphicData uri="http://schemas.openxmlformats.org/drawingml/2006/picture">
+                <pic:pic xmlns:pic="http://schemas.openxmlformats.org/drawingml/2006/picture">
+                  <pic:nvPicPr>
+                    <pic:cNvPr id="1" name=""/>
+                    <pic:cNvPicPr/>
+                  </pic:nvPicPr>
+                  <pic:blipFill>
+                    <a:blip r:embed="rId16">
+                      <a:extLst>
+                        <a:ext uri="{28A0092B-C50C-407E-A947-70E740481C1C}">
+                          <a14:useLocalDpi xmlns:a14="http://schemas.microsoft.com/office/drawing/2010/main" val="0"/>
+                        </a:ext>
+                      </a:extLst>
+                    </a:blip>
+                    <a:stretch>
+                      <a:fillRect/>
+                    </a:stretch>
+                  </pic:blipFill>
+                  <pic:spPr>
+                    <a:xfrm>
+                      <a:off x="0" y="0"/>
+                      <a:ext cx="5731510" cy="4394200"/>
+                    </a:xfrm>
+                    <a:prstGeom prst="rect">
+                      <a:avLst/>
+                    </a:prstGeom>
+                  </pic:spPr>
+                </pic:pic>
+              </a:graphicData>
+            </a:graphic>
+          </wp:inline>
+        </w:drawing>
+      </w:r>
+    </w:p>
+    <w:p>
+      <w:pPr>
+        <w:ind w:firstLine="720"/>
+      </w:pPr>
+      <w:r>
+        <w:t>Using the formula Min and Max</w:t>
+      </w:r>
+      <w:r>
+        <w:t>, I could check the range of the Weight feature. The minimum value was 39kg and the maximum was 173kg, giving a range of 134kg.</w:t>
+      </w:r>
+    </w:p>
+    <w:p>
+      <w:pPr>
+        <w:ind w:firstLine="720"/>
+      </w:pPr>
+      <w:r>
+        <w:t xml:space="preserve">The variance of the data is </w:t>
+      </w:r>
+      <w:r>
+        <w:t>289.4</w:t>
+      </w:r>
+      <w:r>
+        <w:t>5 which indicates a great</w:t>
+      </w:r>
+      <w:r>
+        <w:t xml:space="preserve"> dispersion.</w:t>
       </w:r>
       <w:r>
         <w:t xml:space="preserve"> </w:t>
       </w:r>
       <w:r>
-        <w:t>L</w:t>
-      </w:r>
-      <w:r>
-        <w:t>”. These 3 different kinds of possibilities were encoded as “1”, “2” and “3”. The author didn’t explain why the data was kept like that.</w:t>
+        <w:t>A</w:t>
+      </w:r>
+      <w:r>
+        <w:t xml:space="preserve">nd the standard deviation is </w:t>
+      </w:r>
+      <w:r>
+        <w:t>17.01</w:t>
+      </w:r>
+      <w:r>
+        <w:t xml:space="preserve"> which indicates the range of the data related with the mean.</w:t>
       </w:r>
     </w:p>
     <w:p>
       <w:pPr>
         <w:ind w:firstLine="720"/>
       </w:pPr>
-    </w:p>
-    <w:p>
-      <w:pPr>
-        <w:rPr>
-          <w:ins w:id="305" w:author="Eduardo Flach" w:date="2026-10-24T15:05:00Z"/>
-        </w:rPr>
-      </w:pPr>
+      <w:r>
+        <w:t>Then, using the IQR formula it was possible to check if there are some outliers in the data. Q1 = 58 and Q3=80. The IQR value resulted in 41.95. Plotting the data in a graph we can see that there are some outliers in the data, highlighted in yellow.</w:t>
+      </w:r>
+    </w:p>
+    <w:p>
+      <w:pPr>
+        <w:ind w:firstLine="720"/>
+      </w:pPr>
+      <w:r>
+        <w:lastRenderedPageBreak/>
+        <w:drawing>
+          <wp:inline distT="0" distB="0" distL="0" distR="0" wp14:anchorId="17536CC0" wp14:editId="72D71E14">
+            <wp:extent cx="4625340" cy="3987861"/>
+            <wp:effectExtent l="0" t="0" r="3810" b="0"/>
+            <wp:docPr id="3" name="Imagem 3"/>
+            <wp:cNvGraphicFramePr>
+              <a:graphicFrameLocks xmlns:a="http://schemas.openxmlformats.org/drawingml/2006/main" noChangeAspect="1"/>
+            </wp:cNvGraphicFramePr>
+            <a:graphic xmlns:a="http://schemas.openxmlformats.org/drawingml/2006/main">
+              <a:graphicData uri="http://schemas.openxmlformats.org/drawingml/2006/picture">
+                <pic:pic xmlns:pic="http://schemas.openxmlformats.org/drawingml/2006/picture">
+                  <pic:nvPicPr>
+                    <pic:cNvPr id="1" name=""/>
+                    <pic:cNvPicPr/>
+                  </pic:nvPicPr>
+                  <pic:blipFill>
+                    <a:blip r:embed="rId17"/>
+                    <a:stretch>
+                      <a:fillRect/>
+                    </a:stretch>
+                  </pic:blipFill>
+                  <pic:spPr>
+                    <a:xfrm>
+                      <a:off x="0" y="0"/>
+                      <a:ext cx="4662904" cy="4020247"/>
+                    </a:xfrm>
+                    <a:prstGeom prst="rect">
+                      <a:avLst/>
+                    </a:prstGeom>
+                  </pic:spPr>
+                </pic:pic>
+              </a:graphicData>
+            </a:graphic>
+          </wp:inline>
+        </w:drawing>
+      </w:r>
+    </w:p>
+    <w:p>
       <w:r>
         <w:tab/>
-      </w:r>
-    </w:p>
-    <w:p>
-      <w:pPr>
-        <w:rPr>
-          <w:ins w:id="306" w:author="Eduardo Flach" w:date="2026-10-12T17:25:00Z"/>
-        </w:rPr>
-        <w:pPrChange w:id="307" w:author="Eduardo Flach" w:date="2026-10-24T15:05:00Z">
+        <w:t xml:space="preserve">The kurtosis formula could indicate a presence of outliers in the data set. The number resulted was </w:t>
+      </w:r>
+      <w:r>
+        <w:t>3.00448</w:t>
+      </w:r>
+      <w:r>
+        <w:t>. Numbers higher than 3.00 i</w:t>
+      </w:r>
+      <w:r>
+        <w:t>ndicates that the dataset has heavy tails or outliers. This means that extreme values are more frequent than expected in a normal distribution. </w:t>
+      </w:r>
+      <w:r>
+        <w:t xml:space="preserve">The number is almost exactly in the middle of the turning point number. </w:t>
+      </w:r>
+    </w:p>
+    <w:p>
+      <w:r>
+        <w:tab/>
+        <w:t xml:space="preserve">Other </w:t>
+      </w:r>
+      <w:r>
+        <w:t>feature that is possible to use is the Skewness number. Positive skewness number indicates</w:t>
+      </w:r>
+      <w:r>
+        <w:t xml:space="preserve"> that the tail on the right side of the distribution is longer or fatter than the left side. This often suggests that there are a few high-value outliers.</w:t>
+      </w:r>
+      <w:r>
+        <w:t xml:space="preserve"> As an example, the number 174kg presented in the dataset. The current </w:t>
+      </w:r>
+      <w:r>
+        <w:t>amount</w:t>
+      </w:r>
+      <w:r>
+        <w:t xml:space="preserve"> of skewness for the Weight is </w:t>
+      </w:r>
+      <w:r>
+        <w:t>1.1935</w:t>
+      </w:r>
+      <w:r>
+        <w:t>.</w:t>
+      </w:r>
+    </w:p>
+    <w:p>
+      <w:r>
+        <w:tab/>
+        <w:t xml:space="preserve">Bellow a graph showing the data for Weight, but in the </w:t>
+      </w:r>
+      <w:proofErr w:type="gramStart"/>
+      <w:r>
+        <w:t>y</w:t>
+      </w:r>
+      <w:proofErr w:type="gramEnd"/>
+      <w:r>
+        <w:t xml:space="preserve"> axis was plotted the density of the data instead of the total number.</w:t>
+      </w:r>
+    </w:p>
+    <w:p>
+      <w:r>
+        <w:lastRenderedPageBreak/>
+        <w:drawing>
+          <wp:inline distT="0" distB="0" distL="0" distR="0" wp14:anchorId="2CDF56C1" wp14:editId="2DB9B72E">
+            <wp:extent cx="5059680" cy="3981838"/>
+            <wp:effectExtent l="0" t="0" r="7620" b="0"/>
+            <wp:docPr id="5" name="Imagem 5"/>
+            <wp:cNvGraphicFramePr>
+              <a:graphicFrameLocks xmlns:a="http://schemas.openxmlformats.org/drawingml/2006/main" noChangeAspect="1"/>
+            </wp:cNvGraphicFramePr>
+            <a:graphic xmlns:a="http://schemas.openxmlformats.org/drawingml/2006/main">
+              <a:graphicData uri="http://schemas.openxmlformats.org/drawingml/2006/picture">
+                <pic:pic xmlns:pic="http://schemas.openxmlformats.org/drawingml/2006/picture">
+                  <pic:nvPicPr>
+                    <pic:cNvPr id="1" name=""/>
+                    <pic:cNvPicPr/>
+                  </pic:nvPicPr>
+                  <pic:blipFill>
+                    <a:blip r:embed="rId18"/>
+                    <a:stretch>
+                      <a:fillRect/>
+                    </a:stretch>
+                  </pic:blipFill>
+                  <pic:spPr>
+                    <a:xfrm>
+                      <a:off x="0" y="0"/>
+                      <a:ext cx="5098404" cy="4012313"/>
+                    </a:xfrm>
+                    <a:prstGeom prst="rect">
+                      <a:avLst/>
+                    </a:prstGeom>
+                  </pic:spPr>
+                </pic:pic>
+              </a:graphicData>
+            </a:graphic>
+          </wp:inline>
+        </w:drawing>
+      </w:r>
+    </w:p>
+    <w:p>
+      <w:pPr>
+        <w:ind w:firstLine="720"/>
+      </w:pPr>
+    </w:p>
+    <w:p>
+      <w:pPr>
+        <w:pStyle w:val="Ttulo1"/>
+        <w:spacing w:before="0"/>
+        <w:jc w:val="both"/>
+      </w:pPr>
+      <w:r>
+        <w:t>Binomial and Poison Distribution</w:t>
+      </w:r>
+    </w:p>
+    <w:p/>
+    <w:p>
+      <w:pPr>
+        <w:pStyle w:val="Ttulo1"/>
+        <w:spacing w:before="0"/>
+        <w:jc w:val="both"/>
+      </w:pPr>
+      <w:r>
+        <w:t>Normal Distribution</w:t>
+      </w:r>
+    </w:p>
+    <w:p>
+      <w:r>
+        <w:tab/>
+        <w:t xml:space="preserve">The feature </w:t>
+      </w:r>
+      <w:r>
+        <w:t>that I will analyse is the Height. Usually, this feature behaves like a normal distribution in real live. The objective is to check if for the 498 amount of data it is the same behaviour.</w:t>
+      </w:r>
+    </w:p>
+    <w:p>
+      <w:pPr>
+        <w:ind w:firstLine="720"/>
+      </w:pPr>
+      <w:r>
+        <w:t>First, I plotted a graph to check the shape. The result was similar with a bell shape as bellow.</w:t>
+      </w:r>
+    </w:p>
+    <w:p>
+      <w:pPr>
+        <w:ind w:firstLine="720"/>
+      </w:pPr>
+      <w:r>
+        <w:lastRenderedPageBreak/>
+        <w:drawing>
+          <wp:inline distT="0" distB="0" distL="0" distR="0" wp14:anchorId="72E71AB1" wp14:editId="458B4A83">
+            <wp:extent cx="4007861" cy="3032760"/>
+            <wp:effectExtent l="0" t="0" r="0" b="0"/>
+            <wp:docPr id="6" name="Imagem 6"/>
+            <wp:cNvGraphicFramePr>
+              <a:graphicFrameLocks xmlns:a="http://schemas.openxmlformats.org/drawingml/2006/main" noChangeAspect="1"/>
+            </wp:cNvGraphicFramePr>
+            <a:graphic xmlns:a="http://schemas.openxmlformats.org/drawingml/2006/main">
+              <a:graphicData uri="http://schemas.openxmlformats.org/drawingml/2006/picture">
+                <pic:pic xmlns:pic="http://schemas.openxmlformats.org/drawingml/2006/picture">
+                  <pic:nvPicPr>
+                    <pic:cNvPr id="1" name=""/>
+                    <pic:cNvPicPr/>
+                  </pic:nvPicPr>
+                  <pic:blipFill>
+                    <a:blip r:embed="rId19"/>
+                    <a:stretch>
+                      <a:fillRect/>
+                    </a:stretch>
+                  </pic:blipFill>
+                  <pic:spPr>
+                    <a:xfrm>
+                      <a:off x="0" y="0"/>
+                      <a:ext cx="4010509" cy="3034764"/>
+                    </a:xfrm>
+                    <a:prstGeom prst="rect">
+                      <a:avLst/>
+                    </a:prstGeom>
+                  </pic:spPr>
+                </pic:pic>
+              </a:graphicData>
+            </a:graphic>
+          </wp:inline>
+        </w:drawing>
+      </w:r>
+    </w:p>
+    <w:p>
+      <w:pPr>
+        <w:ind w:firstLine="720"/>
+      </w:pPr>
+      <w:r>
+        <w:t xml:space="preserve">Then, with the mean and standard deviation (std) I used the </w:t>
+      </w:r>
+      <w:r>
+        <w:t>68-95-99.7 empirical rule</w:t>
+      </w:r>
+      <w:r>
+        <w:t>, which states that 68% of the data is within the first std, 95% with the 2</w:t>
+      </w:r>
+      <w:proofErr w:type="gramStart"/>
+      <w:r>
+        <w:rPr>
+          <w:vertAlign w:val="superscript"/>
+        </w:rPr>
+        <w:t>nd</w:t>
+      </w:r>
+      <w:r>
+        <w:rPr>
+          <w:vertAlign w:val="superscript"/>
+        </w:rPr>
+        <w:t xml:space="preserve"> </w:t>
+      </w:r>
+      <w:r>
+        <w:t xml:space="preserve"> std</w:t>
+      </w:r>
+      <w:proofErr w:type="gramEnd"/>
+      <w:r>
+        <w:t xml:space="preserve"> and 99,7% within the 3</w:t>
+      </w:r>
+      <w:r>
+        <w:rPr>
+          <w:vertAlign w:val="superscript"/>
+        </w:rPr>
+        <w:t>rd</w:t>
+      </w:r>
+      <w:r>
+        <w:t xml:space="preserve"> std. The result shows that 67,27% of the data is within the 1</w:t>
+      </w:r>
+      <w:r>
+        <w:rPr>
+          <w:vertAlign w:val="superscript"/>
+        </w:rPr>
+        <w:t>st</w:t>
+      </w:r>
+      <w:r>
+        <w:t xml:space="preserve"> std, 97,39% are within the 2</w:t>
+      </w:r>
+      <w:r>
+        <w:rPr>
+          <w:vertAlign w:val="superscript"/>
+        </w:rPr>
+        <w:t>nd</w:t>
+      </w:r>
+      <w:r>
+        <w:t xml:space="preserve"> std and 99,8% are within the 3</w:t>
+      </w:r>
+      <w:r>
+        <w:rPr>
+          <w:vertAlign w:val="superscript"/>
+        </w:rPr>
+        <w:t>rd</w:t>
+      </w:r>
+      <w:r>
+        <w:t xml:space="preserve"> std.</w:t>
+      </w:r>
+      <w:r>
+        <w:t xml:space="preserve"> It is clear that this data is a normal distribution</w:t>
+      </w:r>
+    </w:p>
+    <w:p>
+      <w:pPr>
+        <w:ind w:firstLine="720"/>
+      </w:pPr>
+      <w:r>
+        <w:t xml:space="preserve">With the function z-score </w:t>
+      </w:r>
+      <w:r>
+        <w:t xml:space="preserve">it is possible to check for all the data how far the current value is from the mean. For example, the first value is </w:t>
+      </w:r>
+      <w:r>
+        <w:t>-0.680491</w:t>
+      </w:r>
+      <w:r>
+        <w:t xml:space="preserve"> far from the mean (</w:t>
+      </w:r>
+      <w:r>
+        <w:t>1.68</w:t>
+      </w:r>
+      <w:r>
+        <w:t>cm), which means that the value is bellow the mean but within the 1</w:t>
+      </w:r>
+      <w:r>
+        <w:rPr>
+          <w:vertAlign w:val="superscript"/>
+        </w:rPr>
+        <w:t>st</w:t>
+      </w:r>
+      <w:r>
+        <w:t xml:space="preserve"> std. </w:t>
+      </w:r>
+    </w:p>
+    <w:p>
+      <w:pPr>
+        <w:ind w:firstLine="720"/>
+      </w:pPr>
+      <w:r>
+        <w:t>I plotted the function head to double check the first value of the data. The number is 1,62 which means the z-score is correct.</w:t>
+      </w:r>
+    </w:p>
+    <w:p>
+      <w:pPr>
+        <w:ind w:firstLine="720"/>
+      </w:pPr>
+      <w:r>
+        <w:t xml:space="preserve">Also, I plotted the Q-Q plot. It </w:t>
+      </w:r>
+      <w:r>
+        <w:t>compares observed quantiles with quantiles expected under a normal distribution. If the data are approximately normal, most points should lie reasonably close to the reference line.</w:t>
+      </w:r>
+      <w:r>
+        <w:t xml:space="preserve"> The results are showed below.</w:t>
+      </w:r>
+    </w:p>
+    <w:p>
+      <w:pPr>
+        <w:ind w:firstLine="720"/>
+      </w:pPr>
+      <w:r>
+        <w:lastRenderedPageBreak/>
+        <w:drawing>
+          <wp:inline distT="0" distB="0" distL="0" distR="0" wp14:anchorId="40821CC9" wp14:editId="208BA550">
+            <wp:extent cx="4377063" cy="3322320"/>
+            <wp:effectExtent l="0" t="0" r="4445" b="0"/>
+            <wp:docPr id="7" name="Imagem 7"/>
+            <wp:cNvGraphicFramePr>
+              <a:graphicFrameLocks xmlns:a="http://schemas.openxmlformats.org/drawingml/2006/main" noChangeAspect="1"/>
+            </wp:cNvGraphicFramePr>
+            <a:graphic xmlns:a="http://schemas.openxmlformats.org/drawingml/2006/main">
+              <a:graphicData uri="http://schemas.openxmlformats.org/drawingml/2006/picture">
+                <pic:pic xmlns:pic="http://schemas.openxmlformats.org/drawingml/2006/picture">
+                  <pic:nvPicPr>
+                    <pic:cNvPr id="1" name=""/>
+                    <pic:cNvPicPr/>
+                  </pic:nvPicPr>
+                  <pic:blipFill>
+                    <a:blip r:embed="rId20"/>
+                    <a:stretch>
+                      <a:fillRect/>
+                    </a:stretch>
+                  </pic:blipFill>
+                  <pic:spPr>
+                    <a:xfrm>
+                      <a:off x="0" y="0"/>
+                      <a:ext cx="4380930" cy="3325255"/>
+                    </a:xfrm>
+                    <a:prstGeom prst="rect">
+                      <a:avLst/>
+                    </a:prstGeom>
+                  </pic:spPr>
+                </pic:pic>
+              </a:graphicData>
+            </a:graphic>
+          </wp:inline>
+        </w:drawing>
+      </w:r>
+    </w:p>
+    <w:p>
+      <w:pPr>
+        <w:ind w:firstLine="720"/>
+      </w:pPr>
+    </w:p>
+    <w:p>
+      <w:pPr>
+        <w:ind w:firstLine="720"/>
+      </w:pPr>
+    </w:p>
+    <w:p>
+      <w:pPr>
+        <w:rPr>
+          <w:ins w:id="305" w:author="Eduardo Flach" w:date="2026-10-12T17:14:00Z"/>
+        </w:rPr>
+      </w:pPr>
+      <w:r>
+        <w:tab/>
+      </w:r>
+    </w:p>
+    <w:p>
+      <w:pPr>
+        <w:rPr>
+          <w:ins w:id="306" w:author="Eduardo Flach" w:date="2026-10-12T17:14:00Z"/>
+        </w:rPr>
+      </w:pPr>
+    </w:p>
+    <w:p>
+      <w:pPr>
+        <w:jc w:val="both"/>
+        <w:rPr>
+          <w:ins w:id="307" w:author="Eduardo Flach" w:date="2026-10-12T17:14:00Z"/>
+        </w:rPr>
+        <w:pPrChange w:id="308" w:author="Eduardo Flach" w:date="2026-10-24T15:05:00Z">
+          <w:pPr/>
+        </w:pPrChange>
+      </w:pPr>
+      <w:ins w:id="309" w:author="Eduardo Flach" w:date="2026-10-16T15:01:00Z">
+        <w:r>
+          <w:tab/>
+        </w:r>
+      </w:ins>
+    </w:p>
+    <w:p>
+      <w:pPr>
+        <w:pStyle w:val="Ttulo1"/>
+        <w:spacing w:before="0"/>
+        <w:jc w:val="both"/>
+        <w:rPr>
+          <w:ins w:id="310" w:author="Eduardo Flach" w:date="2026-10-20T11:51:00Z"/>
+        </w:rPr>
+        <w:pPrChange w:id="311" w:author="Eduardo Flach" w:date="2026-10-24T15:05:00Z">
+          <w:pPr/>
+        </w:pPrChange>
+      </w:pPr>
+    </w:p>
+    <w:p>
+      <w:pPr>
+        <w:rPr>
+          <w:del w:id="312" w:author="Eduardo Flach" w:date="2026-10-21T19:36:00Z"/>
+        </w:rPr>
+      </w:pPr>
+    </w:p>
+    <w:p>
+      <w:pPr>
+        <w:rPr>
+          <w:ins w:id="313" w:author="Eduardo Flach" w:date="2026-10-24T15:05:00Z"/>
+        </w:rPr>
+      </w:pPr>
+    </w:p>
+    <w:p>
+      <w:pPr>
+        <w:rPr>
+          <w:ins w:id="314" w:author="Eduardo Flach" w:date="2026-10-24T15:05:00Z"/>
+        </w:rPr>
+      </w:pPr>
+    </w:p>
+    <w:p>
+      <w:pPr>
+        <w:rPr>
+          <w:ins w:id="315" w:author="Eduardo Flach" w:date="2026-10-24T15:05:00Z"/>
+        </w:rPr>
+      </w:pPr>
+    </w:p>
+    <w:p>
+      <w:pPr>
+        <w:rPr>
+          <w:ins w:id="316" w:author="Eduardo Flach" w:date="2026-10-24T15:05:00Z"/>
+        </w:rPr>
+      </w:pPr>
+    </w:p>
+    <w:p>
+      <w:pPr>
+        <w:rPr>
+          <w:ins w:id="317" w:author="Eduardo Flach" w:date="2026-10-24T15:05:00Z"/>
+        </w:rPr>
+      </w:pPr>
+    </w:p>
+    <w:p>
+      <w:pPr>
+        <w:rPr>
+          <w:ins w:id="318" w:author="Eduardo Flach" w:date="2026-10-24T15:05:00Z"/>
+        </w:rPr>
+      </w:pPr>
+    </w:p>
+    <w:p>
+      <w:pPr>
+        <w:rPr>
+          <w:ins w:id="319" w:author="Eduardo Flach" w:date="2026-10-24T15:05:00Z"/>
+        </w:rPr>
+      </w:pPr>
+    </w:p>
+    <w:p>
+      <w:pPr>
+        <w:rPr>
+          <w:ins w:id="320" w:author="Eduardo Flach" w:date="2026-10-24T15:05:00Z"/>
+        </w:rPr>
+      </w:pPr>
+    </w:p>
+    <w:p>
+      <w:pPr>
+        <w:rPr>
+          <w:ins w:id="321" w:author="Eduardo Flach" w:date="2026-10-24T15:05:00Z"/>
+        </w:rPr>
+      </w:pPr>
+    </w:p>
+    <w:p>
+      <w:pPr>
+        <w:rPr>
+          <w:ins w:id="322" w:author="Eduardo Flach" w:date="2026-10-24T15:05:00Z"/>
+        </w:rPr>
+      </w:pPr>
+    </w:p>
+    <w:p>
+      <w:pPr>
+        <w:rPr>
+          <w:ins w:id="323" w:author="Eduardo Flach" w:date="2026-10-24T15:05:00Z"/>
+        </w:rPr>
+      </w:pPr>
+    </w:p>
+    <w:p>
+      <w:pPr>
+        <w:rPr>
+          <w:ins w:id="324" w:author="Eduardo Flach" w:date="2026-10-24T15:05:00Z"/>
+        </w:rPr>
+      </w:pPr>
+    </w:p>
+    <w:p>
+      <w:pPr>
+        <w:rPr>
+          <w:ins w:id="325" w:author="Eduardo Flach" w:date="2026-10-24T15:05:00Z"/>
+        </w:rPr>
+      </w:pPr>
+    </w:p>
+    <w:p>
+      <w:pPr>
+        <w:rPr>
+          <w:ins w:id="326" w:author="Eduardo Flach" w:date="2026-10-24T15:05:00Z"/>
+        </w:rPr>
+      </w:pPr>
+    </w:p>
+    <w:p>
+      <w:pPr>
+        <w:rPr>
+          <w:ins w:id="327" w:author="Eduardo Flach" w:date="2026-10-24T15:05:00Z"/>
+        </w:rPr>
+      </w:pPr>
+    </w:p>
+    <w:p>
+      <w:pPr>
+        <w:rPr>
+          <w:ins w:id="328" w:author="Eduardo Flach" w:date="2026-10-24T15:05:00Z"/>
+        </w:rPr>
+      </w:pPr>
+    </w:p>
+    <w:p>
+      <w:pPr>
+        <w:rPr>
+          <w:ins w:id="329" w:author="Eduardo Flach" w:date="2026-10-24T15:05:00Z"/>
+        </w:rPr>
+      </w:pPr>
+    </w:p>
+    <w:p>
+      <w:pPr>
+        <w:rPr>
+          <w:ins w:id="330" w:author="Eduardo Flach" w:date="2026-10-24T15:05:00Z"/>
+        </w:rPr>
+      </w:pPr>
+    </w:p>
+    <w:p>
+      <w:pPr>
+        <w:rPr>
+          <w:ins w:id="331" w:author="Eduardo Flach" w:date="2026-10-24T15:05:00Z"/>
+        </w:rPr>
+      </w:pPr>
+    </w:p>
+    <w:p>
+      <w:pPr>
+        <w:rPr>
+          <w:ins w:id="332" w:author="Eduardo Flach" w:date="2026-10-24T15:05:00Z"/>
+        </w:rPr>
+        <w:pPrChange w:id="333" w:author="Eduardo Flach" w:date="2026-10-12T17:14:00Z">
           <w:pPr>
             <w:pStyle w:val="Ttulo1"/>
             <w:spacing w:before="0"/>
@@ -5541,249 +6268,44 @@
     </w:p>
     <w:p>
       <w:pPr>
-        <w:pStyle w:val="Ttulo1"/>
-        <w:spacing w:before="0"/>
-        <w:jc w:val="both"/>
-        <w:rPr>
-          <w:ins w:id="308" w:author="Eduardo Flach" w:date="2026-10-12T17:14:00Z"/>
-        </w:rPr>
-        <w:pPrChange w:id="309" w:author="Eduardo Flach" w:date="2026-10-20T11:58:00Z">
-          <w:pPr>
-            <w:pStyle w:val="Ttulo1"/>
-            <w:spacing w:before="0"/>
-          </w:pPr>
-        </w:pPrChange>
-      </w:pPr>
-      <w:bookmarkStart w:id="310" w:name="_Toc243746805"/>
-      <w:ins w:id="311" w:author="Eduardo Flach" w:date="2026-10-12T17:14:00Z">
-        <w:r>
-          <w:t>Aim and Objectives</w:t>
-        </w:r>
-        <w:bookmarkEnd w:id="310"/>
-      </w:ins>
-    </w:p>
-    <w:p>
-      <w:pPr>
-        <w:jc w:val="both"/>
-        <w:rPr>
-          <w:ins w:id="312" w:author="Eduardo Flach" w:date="2026-10-12T17:14:00Z"/>
-        </w:rPr>
-        <w:pPrChange w:id="313" w:author="Eduardo Flach" w:date="2026-10-24T15:05:00Z">
-          <w:pPr/>
-        </w:pPrChange>
-      </w:pPr>
-      <w:ins w:id="314" w:author="Eduardo Flach" w:date="2026-10-16T15:01:00Z">
-        <w:r>
-          <w:tab/>
-        </w:r>
-      </w:ins>
-    </w:p>
-    <w:p>
-      <w:pPr>
-        <w:pStyle w:val="Ttulo1"/>
-        <w:spacing w:before="0"/>
-        <w:jc w:val="both"/>
-        <w:rPr>
-          <w:ins w:id="315" w:author="Eduardo Flach" w:date="2026-10-20T11:51:00Z"/>
-        </w:rPr>
-        <w:pPrChange w:id="316" w:author="Eduardo Flach" w:date="2026-10-24T15:05:00Z">
-          <w:pPr/>
-        </w:pPrChange>
-      </w:pPr>
-    </w:p>
-    <w:p>
-      <w:pPr>
-        <w:rPr>
-          <w:del w:id="317" w:author="Eduardo Flach" w:date="2026-10-21T19:36:00Z"/>
-        </w:rPr>
-      </w:pPr>
-    </w:p>
-    <w:p>
-      <w:pPr>
-        <w:rPr>
-          <w:ins w:id="318" w:author="Eduardo Flach" w:date="2026-10-24T15:05:00Z"/>
-        </w:rPr>
-      </w:pPr>
-    </w:p>
-    <w:p>
-      <w:pPr>
-        <w:rPr>
-          <w:ins w:id="319" w:author="Eduardo Flach" w:date="2026-10-24T15:05:00Z"/>
-        </w:rPr>
-      </w:pPr>
-    </w:p>
-    <w:p>
-      <w:pPr>
-        <w:rPr>
-          <w:ins w:id="320" w:author="Eduardo Flach" w:date="2026-10-24T15:05:00Z"/>
-        </w:rPr>
-      </w:pPr>
-    </w:p>
-    <w:p>
-      <w:pPr>
-        <w:rPr>
-          <w:ins w:id="321" w:author="Eduardo Flach" w:date="2026-10-24T15:05:00Z"/>
-        </w:rPr>
-      </w:pPr>
-    </w:p>
-    <w:p>
-      <w:pPr>
-        <w:rPr>
-          <w:ins w:id="322" w:author="Eduardo Flach" w:date="2026-10-24T15:05:00Z"/>
-        </w:rPr>
-      </w:pPr>
-    </w:p>
-    <w:p>
-      <w:pPr>
-        <w:rPr>
-          <w:ins w:id="323" w:author="Eduardo Flach" w:date="2026-10-24T15:05:00Z"/>
-        </w:rPr>
-      </w:pPr>
-    </w:p>
-    <w:p>
-      <w:pPr>
-        <w:rPr>
-          <w:ins w:id="324" w:author="Eduardo Flach" w:date="2026-10-24T15:05:00Z"/>
-        </w:rPr>
-      </w:pPr>
-    </w:p>
-    <w:p>
-      <w:pPr>
-        <w:rPr>
-          <w:ins w:id="325" w:author="Eduardo Flach" w:date="2026-10-24T15:05:00Z"/>
-        </w:rPr>
-      </w:pPr>
-    </w:p>
-    <w:p>
-      <w:pPr>
-        <w:rPr>
-          <w:ins w:id="326" w:author="Eduardo Flach" w:date="2026-10-24T15:05:00Z"/>
-        </w:rPr>
-      </w:pPr>
-    </w:p>
-    <w:p>
-      <w:pPr>
-        <w:rPr>
-          <w:ins w:id="327" w:author="Eduardo Flach" w:date="2026-10-24T15:05:00Z"/>
-        </w:rPr>
-      </w:pPr>
-    </w:p>
-    <w:p>
-      <w:pPr>
-        <w:rPr>
-          <w:ins w:id="328" w:author="Eduardo Flach" w:date="2026-10-24T15:05:00Z"/>
-        </w:rPr>
-      </w:pPr>
-    </w:p>
-    <w:p>
-      <w:pPr>
-        <w:rPr>
-          <w:ins w:id="329" w:author="Eduardo Flach" w:date="2026-10-24T15:05:00Z"/>
-        </w:rPr>
-      </w:pPr>
-    </w:p>
-    <w:p>
-      <w:pPr>
-        <w:rPr>
-          <w:ins w:id="330" w:author="Eduardo Flach" w:date="2026-10-24T15:05:00Z"/>
-        </w:rPr>
-      </w:pPr>
-    </w:p>
-    <w:p>
-      <w:pPr>
-        <w:rPr>
-          <w:ins w:id="331" w:author="Eduardo Flach" w:date="2026-10-24T15:05:00Z"/>
-        </w:rPr>
-      </w:pPr>
-    </w:p>
-    <w:p>
-      <w:pPr>
-        <w:rPr>
-          <w:ins w:id="332" w:author="Eduardo Flach" w:date="2026-10-24T15:05:00Z"/>
-        </w:rPr>
-      </w:pPr>
-    </w:p>
-    <w:p>
-      <w:pPr>
-        <w:rPr>
-          <w:ins w:id="333" w:author="Eduardo Flach" w:date="2026-10-24T15:05:00Z"/>
-        </w:rPr>
-      </w:pPr>
-    </w:p>
-    <w:p>
-      <w:pPr>
-        <w:rPr>
-          <w:ins w:id="334" w:author="Eduardo Flach" w:date="2026-10-24T15:05:00Z"/>
-        </w:rPr>
-      </w:pPr>
-    </w:p>
-    <w:p>
-      <w:pPr>
-        <w:rPr>
-          <w:ins w:id="335" w:author="Eduardo Flach" w:date="2026-10-24T15:05:00Z"/>
-        </w:rPr>
-      </w:pPr>
-    </w:p>
-    <w:p>
-      <w:pPr>
-        <w:rPr>
-          <w:ins w:id="336" w:author="Eduardo Flach" w:date="2026-10-24T15:05:00Z"/>
-        </w:rPr>
-      </w:pPr>
-    </w:p>
-    <w:p>
-      <w:pPr>
-        <w:rPr>
-          <w:ins w:id="337" w:author="Eduardo Flach" w:date="2026-10-24T15:05:00Z"/>
-        </w:rPr>
-        <w:pPrChange w:id="338" w:author="Eduardo Flach" w:date="2026-10-12T17:14:00Z">
-          <w:pPr>
-            <w:pStyle w:val="Ttulo1"/>
-            <w:spacing w:before="0"/>
-          </w:pPr>
-        </w:pPrChange>
-      </w:pPr>
-    </w:p>
-    <w:p>
-      <w:pPr>
         <w:pStyle w:val="Ttulo2"/>
         <w:rPr>
+          <w:del w:id="334" w:author="Eduardo Flach" w:date="2026-10-21T19:36:00Z"/>
+        </w:rPr>
+      </w:pPr>
+      <w:del w:id="335" w:author="Eduardo Flach" w:date="2026-10-21T19:36:00Z">
+        <w:r>
+          <w:delText>Chapter 1.1</w:delText>
+        </w:r>
+      </w:del>
+    </w:p>
+    <w:p>
+      <w:pPr>
+        <w:pStyle w:val="Ttulo3"/>
+        <w:rPr>
+          <w:del w:id="336" w:author="Eduardo Flach" w:date="2026-10-21T19:36:00Z"/>
+        </w:rPr>
+      </w:pPr>
+      <w:del w:id="337" w:author="Eduardo Flach" w:date="2026-10-21T19:36:00Z">
+        <w:r>
+          <w:delText>Chapter 1.1.1.</w:delText>
+        </w:r>
+      </w:del>
+    </w:p>
+    <w:p>
+      <w:pPr>
+        <w:rPr>
+          <w:del w:id="338" w:author="Eduardo Flach" w:date="2026-10-21T19:36:00Z"/>
+        </w:rPr>
+      </w:pPr>
+    </w:p>
+    <w:p>
+      <w:pPr>
+        <w:rPr>
           <w:del w:id="339" w:author="Eduardo Flach" w:date="2026-10-21T19:36:00Z"/>
         </w:rPr>
       </w:pPr>
       <w:del w:id="340" w:author="Eduardo Flach" w:date="2026-10-21T19:36:00Z">
-        <w:r>
-          <w:delText>Chapter 1.1</w:delText>
-        </w:r>
-      </w:del>
-    </w:p>
-    <w:p>
-      <w:pPr>
-        <w:pStyle w:val="Ttulo3"/>
-        <w:rPr>
-          <w:del w:id="341" w:author="Eduardo Flach" w:date="2026-10-21T19:36:00Z"/>
-        </w:rPr>
-      </w:pPr>
-      <w:del w:id="342" w:author="Eduardo Flach" w:date="2026-10-21T19:36:00Z">
-        <w:r>
-          <w:delText>Chapter 1.1.1.</w:delText>
-        </w:r>
-      </w:del>
-    </w:p>
-    <w:p>
-      <w:pPr>
-        <w:rPr>
-          <w:del w:id="343" w:author="Eduardo Flach" w:date="2026-10-21T19:36:00Z"/>
-        </w:rPr>
-      </w:pPr>
-    </w:p>
-    <w:p>
-      <w:pPr>
-        <w:rPr>
-          <w:del w:id="344" w:author="Eduardo Flach" w:date="2026-10-21T19:36:00Z"/>
-        </w:rPr>
-      </w:pPr>
-      <w:del w:id="345" w:author="Eduardo Flach" w:date="2026-10-21T19:36:00Z">
         <w:r>
           <w:rPr>
             <w:noProof/>
@@ -5802,7 +6324,7 @@
                       <pic:cNvPicPr preferRelativeResize="0"/>
                     </pic:nvPicPr>
                     <pic:blipFill>
-                      <a:blip r:embed="rId15"/>
+                      <a:blip r:embed="rId21"/>
                       <a:srcRect/>
                       <a:stretch>
                         <a:fillRect/>
@@ -5829,235 +6351,235 @@
     <w:p>
       <w:pPr>
         <w:rPr>
+          <w:del w:id="341" w:author="Eduardo Flach" w:date="2026-10-21T19:36:00Z"/>
+          <w:color w:val="FF0000"/>
+        </w:rPr>
+      </w:pPr>
+    </w:p>
+    <w:p>
+      <w:pPr>
+        <w:rPr>
+          <w:del w:id="342" w:author="Eduardo Flach" w:date="2026-10-21T19:36:00Z"/>
+          <w:color w:val="FF0000"/>
+        </w:rPr>
+      </w:pPr>
+      <w:del w:id="343" w:author="Eduardo Flach" w:date="2026-10-21T19:36:00Z">
+        <w:r>
+          <w:rPr>
+            <w:color w:val="FF0000"/>
+          </w:rPr>
+          <w:delText>[NOTE: For the table of contents to function properly, you must use the correct headings for all your chapters and subchapters.</w:delText>
+        </w:r>
+      </w:del>
+    </w:p>
+    <w:p>
+      <w:pPr>
+        <w:rPr>
+          <w:del w:id="344" w:author="Eduardo Flach" w:date="2026-10-21T19:36:00Z"/>
+          <w:color w:val="FF0000"/>
+        </w:rPr>
+      </w:pPr>
+      <w:del w:id="345" w:author="Eduardo Flach" w:date="2026-10-21T19:36:00Z">
+        <w:r>
+          <w:rPr>
+            <w:b/>
+            <w:color w:val="FF0000"/>
+          </w:rPr>
+          <w:delText>Heading 1:</w:delText>
+        </w:r>
+        <w:r>
+          <w:rPr>
+            <w:color w:val="FF0000"/>
+          </w:rPr>
+          <w:delText xml:space="preserve"> This is the main heading and should be employed for the primary title or chapter. For example: CHAPTER 1.</w:delText>
+        </w:r>
+      </w:del>
+    </w:p>
+    <w:p>
+      <w:pPr>
+        <w:rPr>
           <w:del w:id="346" w:author="Eduardo Flach" w:date="2026-10-21T19:36:00Z"/>
           <w:color w:val="FF0000"/>
         </w:rPr>
       </w:pPr>
-    </w:p>
-    <w:p>
-      <w:pPr>
-        <w:rPr>
-          <w:del w:id="347" w:author="Eduardo Flach" w:date="2026-10-21T19:36:00Z"/>
-          <w:color w:val="FF0000"/>
-        </w:rPr>
-      </w:pPr>
-      <w:del w:id="348" w:author="Eduardo Flach" w:date="2026-10-21T19:36:00Z">
-        <w:r>
-          <w:rPr>
-            <w:color w:val="FF0000"/>
-          </w:rPr>
-          <w:delText>[NOTE: For the table of contents to function properly, you must use the correct headings for all your chapters and subchapters.</w:delText>
-        </w:r>
-      </w:del>
-    </w:p>
-    <w:p>
-      <w:pPr>
-        <w:rPr>
-          <w:del w:id="349" w:author="Eduardo Flach" w:date="2026-10-21T19:36:00Z"/>
-          <w:color w:val="FF0000"/>
-        </w:rPr>
-      </w:pPr>
-      <w:del w:id="350" w:author="Eduardo Flach" w:date="2026-10-21T19:36:00Z">
+      <w:del w:id="347" w:author="Eduardo Flach" w:date="2026-10-21T19:36:00Z">
         <w:r>
           <w:rPr>
             <w:b/>
             <w:color w:val="FF0000"/>
           </w:rPr>
-          <w:delText>Heading 1:</w:delText>
+          <w:delText>Heading 2:</w:delText>
         </w:r>
         <w:r>
           <w:rPr>
             <w:color w:val="FF0000"/>
           </w:rPr>
-          <w:delText xml:space="preserve"> This is the main heading and should be employed for the primary title or chapter. For example: CHAPTER 1.</w:delText>
+          <w:delText xml:space="preserve"> Use Heading 2 as a subheading. For instance: Chapter 1.1.</w:delText>
         </w:r>
       </w:del>
     </w:p>
     <w:p>
       <w:pPr>
         <w:rPr>
-          <w:del w:id="351" w:author="Eduardo Flach" w:date="2026-10-21T19:36:00Z"/>
+          <w:del w:id="348" w:author="Eduardo Flach" w:date="2026-10-21T19:36:00Z"/>
           <w:color w:val="FF0000"/>
         </w:rPr>
       </w:pPr>
-      <w:del w:id="352" w:author="Eduardo Flach" w:date="2026-10-21T19:36:00Z">
+      <w:del w:id="349" w:author="Eduardo Flach" w:date="2026-10-21T19:36:00Z">
         <w:r>
           <w:rPr>
             <w:b/>
             <w:color w:val="FF0000"/>
           </w:rPr>
-          <w:delText>Heading 2:</w:delText>
+          <w:delText>Heading 3:</w:delText>
         </w:r>
         <w:r>
           <w:rPr>
             <w:color w:val="FF0000"/>
           </w:rPr>
-          <w:delText xml:space="preserve"> Use Heading 2 as a subheading. For instance: Chapter 1.1.</w:delText>
+          <w:delText xml:space="preserve"> Heading 3 provides a more detailed breakdown, such as Chapter 1.1.1.</w:delText>
         </w:r>
       </w:del>
     </w:p>
     <w:p>
       <w:pPr>
         <w:rPr>
-          <w:del w:id="353" w:author="Eduardo Flach" w:date="2026-10-21T19:36:00Z"/>
+          <w:del w:id="350" w:author="Eduardo Flach" w:date="2026-10-21T19:36:00Z"/>
           <w:color w:val="FF0000"/>
         </w:rPr>
       </w:pPr>
-      <w:del w:id="354" w:author="Eduardo Flach" w:date="2026-10-21T19:36:00Z">
-        <w:r>
-          <w:rPr>
-            <w:b/>
+      <w:del w:id="351" w:author="Eduardo Flach" w:date="2026-10-21T19:36:00Z">
+        <w:r>
+          <w:rPr>
             <w:color w:val="FF0000"/>
           </w:rPr>
-          <w:delText>Heading 3:</w:delText>
-        </w:r>
+          <w:delText>By adhering to this hierarchical structure, you ensure an organized and effective document outline, enhancing readability and navigation. However, you are not forced to use all 3 headings, usually heading 1 and 2 are sufficient.</w:delText>
+        </w:r>
+      </w:del>
+    </w:p>
+    <w:p>
+      <w:pPr>
+        <w:rPr>
+          <w:del w:id="352" w:author="Eduardo Flach" w:date="2026-10-21T19:36:00Z"/>
+          <w:color w:val="FF0000"/>
+        </w:rPr>
+      </w:pPr>
+      <w:del w:id="353" w:author="Eduardo Flach" w:date="2026-10-21T19:36:00Z">
         <w:r>
           <w:rPr>
             <w:color w:val="FF0000"/>
           </w:rPr>
-          <w:delText xml:space="preserve"> Heading 3 provides a more detailed breakdown, such as Chapter 1.1.1.</w:delText>
+          <w:delText>The remainder of your text should be written using a normal font.]</w:delText>
         </w:r>
       </w:del>
     </w:p>
     <w:p>
       <w:pPr>
         <w:rPr>
-          <w:del w:id="355" w:author="Eduardo Flach" w:date="2026-10-21T19:36:00Z"/>
-          <w:color w:val="FF0000"/>
-        </w:rPr>
-      </w:pPr>
-      <w:del w:id="356" w:author="Eduardo Flach" w:date="2026-10-21T19:36:00Z">
-        <w:r>
-          <w:rPr>
-            <w:color w:val="FF0000"/>
-          </w:rPr>
-          <w:delText>By adhering to this hierarchical structure, you ensure an organized and effective document outline, enhancing readability and navigation. However, you are not forced to use all 3 headings, usually heading 1 and 2 are sufficient.</w:delText>
+          <w:del w:id="354" w:author="Eduardo Flach" w:date="2026-10-23T09:43:00Z"/>
+        </w:rPr>
+      </w:pPr>
+    </w:p>
+    <w:p>
+      <w:pPr>
+        <w:rPr>
+          <w:ins w:id="355" w:author="Eduardo Flach" w:date="2026-10-23T09:43:00Z"/>
+        </w:rPr>
+      </w:pPr>
+    </w:p>
+    <w:p>
+      <w:pPr>
+        <w:rPr>
+          <w:ins w:id="356" w:author="Eduardo Flach" w:date="2026-10-23T09:43:00Z"/>
+        </w:rPr>
+      </w:pPr>
+    </w:p>
+    <w:p>
+      <w:pPr>
+        <w:rPr>
+          <w:del w:id="357" w:author="Eduardo Flach" w:date="2026-10-23T09:43:00Z"/>
+        </w:rPr>
+      </w:pPr>
+    </w:p>
+    <w:p>
+      <w:pPr>
+        <w:rPr>
+          <w:del w:id="358" w:author="Eduardo Flach" w:date="2026-10-23T09:43:00Z"/>
+        </w:rPr>
+      </w:pPr>
+    </w:p>
+    <w:p>
+      <w:pPr>
+        <w:rPr>
+          <w:del w:id="359" w:author="Eduardo Flach" w:date="2026-10-23T09:43:00Z"/>
+        </w:rPr>
+      </w:pPr>
+    </w:p>
+    <w:p>
+      <w:pPr>
+        <w:rPr>
+          <w:del w:id="360" w:author="Eduardo Flach" w:date="2026-10-23T09:43:00Z"/>
+        </w:rPr>
+      </w:pPr>
+    </w:p>
+    <w:p>
+      <w:pPr>
+        <w:rPr>
+          <w:del w:id="361" w:author="Eduardo Flach" w:date="2026-10-23T09:43:00Z"/>
+        </w:rPr>
+      </w:pPr>
+    </w:p>
+    <w:p>
+      <w:pPr>
+        <w:rPr>
+          <w:del w:id="362" w:author="Eduardo Flach" w:date="2026-10-23T09:43:00Z"/>
+        </w:rPr>
+      </w:pPr>
+    </w:p>
+    <w:p>
+      <w:pPr>
+        <w:rPr>
+          <w:del w:id="363" w:author="Eduardo Flach" w:date="2026-10-23T09:43:00Z"/>
+        </w:rPr>
+      </w:pPr>
+    </w:p>
+    <w:p>
+      <w:pPr>
+        <w:rPr>
+          <w:del w:id="364" w:author="Eduardo Flach" w:date="2026-10-23T09:43:00Z"/>
+        </w:rPr>
+      </w:pPr>
+    </w:p>
+    <w:p>
+      <w:pPr>
+        <w:rPr>
+          <w:del w:id="365" w:author="Eduardo Flach" w:date="2026-10-23T09:43:00Z"/>
+        </w:rPr>
+      </w:pPr>
+    </w:p>
+    <w:p>
+      <w:pPr>
+        <w:rPr>
+          <w:del w:id="366" w:author="Eduardo Flach" w:date="2026-10-23T09:43:00Z"/>
+        </w:rPr>
+      </w:pPr>
+    </w:p>
+    <w:p/>
+    <w:p>
+      <w:pPr>
+        <w:pStyle w:val="Ttulo1"/>
+        <w:rPr>
+          <w:del w:id="367" w:author="Eduardo Flach" w:date="2026-10-21T20:25:00Z"/>
+        </w:rPr>
+      </w:pPr>
+      <w:del w:id="368" w:author="Eduardo Flach" w:date="2026-10-21T20:25:00Z">
+        <w:r>
+          <w:delText>References</w:delText>
         </w:r>
       </w:del>
     </w:p>
-    <w:p>
-      <w:pPr>
-        <w:rPr>
-          <w:del w:id="357" w:author="Eduardo Flach" w:date="2026-10-21T19:36:00Z"/>
-          <w:color w:val="FF0000"/>
-        </w:rPr>
-      </w:pPr>
-      <w:del w:id="358" w:author="Eduardo Flach" w:date="2026-10-21T19:36:00Z">
-        <w:r>
-          <w:rPr>
-            <w:color w:val="FF0000"/>
-          </w:rPr>
-          <w:delText>The remainder of your text should be written using a normal font.]</w:delText>
-        </w:r>
-      </w:del>
-    </w:p>
-    <w:p>
-      <w:pPr>
-        <w:rPr>
-          <w:del w:id="359" w:author="Eduardo Flach" w:date="2026-10-23T09:43:00Z"/>
-        </w:rPr>
-      </w:pPr>
-    </w:p>
-    <w:p>
-      <w:pPr>
-        <w:rPr>
-          <w:ins w:id="360" w:author="Eduardo Flach" w:date="2026-10-23T09:43:00Z"/>
-        </w:rPr>
-      </w:pPr>
-    </w:p>
-    <w:p>
-      <w:pPr>
-        <w:rPr>
-          <w:ins w:id="361" w:author="Eduardo Flach" w:date="2026-10-23T09:43:00Z"/>
-        </w:rPr>
-      </w:pPr>
-    </w:p>
-    <w:p>
-      <w:pPr>
-        <w:rPr>
-          <w:del w:id="362" w:author="Eduardo Flach" w:date="2026-10-23T09:43:00Z"/>
-        </w:rPr>
-      </w:pPr>
-    </w:p>
-    <w:p>
-      <w:pPr>
-        <w:rPr>
-          <w:del w:id="363" w:author="Eduardo Flach" w:date="2026-10-23T09:43:00Z"/>
-        </w:rPr>
-      </w:pPr>
-    </w:p>
-    <w:p>
-      <w:pPr>
-        <w:rPr>
-          <w:del w:id="364" w:author="Eduardo Flach" w:date="2026-10-23T09:43:00Z"/>
-        </w:rPr>
-      </w:pPr>
-    </w:p>
-    <w:p>
-      <w:pPr>
-        <w:rPr>
-          <w:del w:id="365" w:author="Eduardo Flach" w:date="2026-10-23T09:43:00Z"/>
-        </w:rPr>
-      </w:pPr>
-    </w:p>
-    <w:p>
-      <w:pPr>
-        <w:rPr>
-          <w:del w:id="366" w:author="Eduardo Flach" w:date="2026-10-23T09:43:00Z"/>
-        </w:rPr>
-      </w:pPr>
-    </w:p>
-    <w:p>
-      <w:pPr>
-        <w:rPr>
-          <w:del w:id="367" w:author="Eduardo Flach" w:date="2026-10-23T09:43:00Z"/>
-        </w:rPr>
-      </w:pPr>
-    </w:p>
-    <w:p>
-      <w:pPr>
-        <w:rPr>
-          <w:del w:id="368" w:author="Eduardo Flach" w:date="2026-10-23T09:43:00Z"/>
-        </w:rPr>
-      </w:pPr>
-    </w:p>
-    <w:p>
-      <w:pPr>
-        <w:rPr>
-          <w:del w:id="369" w:author="Eduardo Flach" w:date="2026-10-23T09:43:00Z"/>
-        </w:rPr>
-      </w:pPr>
-    </w:p>
-    <w:p>
-      <w:pPr>
-        <w:rPr>
-          <w:del w:id="370" w:author="Eduardo Flach" w:date="2026-10-23T09:43:00Z"/>
-        </w:rPr>
-      </w:pPr>
-    </w:p>
-    <w:p>
-      <w:pPr>
-        <w:rPr>
-          <w:del w:id="371" w:author="Eduardo Flach" w:date="2026-10-23T09:43:00Z"/>
-        </w:rPr>
-      </w:pPr>
-    </w:p>
-    <w:p/>
-    <w:p>
-      <w:pPr>
-        <w:pStyle w:val="Ttulo1"/>
-        <w:rPr>
-          <w:del w:id="372" w:author="Eduardo Flach" w:date="2026-10-21T20:25:00Z"/>
-        </w:rPr>
-      </w:pPr>
-      <w:del w:id="373" w:author="Eduardo Flach" w:date="2026-10-21T20:25:00Z">
-        <w:r>
-          <w:delText>References</w:delText>
-        </w:r>
-      </w:del>
-    </w:p>
-    <w:customXmlInsRangeStart w:id="374" w:author="Eduardo Flach" w:date="2026-10-21T20:25:00Z"/>
-    <w:bookmarkStart w:id="375" w:name="_Toc243746806" w:displacedByCustomXml="next"/>
+    <w:customXmlInsRangeStart w:id="369" w:author="Eduardo Flach" w:date="2026-10-21T20:25:00Z"/>
+    <w:bookmarkStart w:id="370" w:name="_Toc243746806" w:displacedByCustomXml="next"/>
     <w:sdt>
       <w:sdtPr>
         <w:rPr>
@@ -6081,18 +6603,18 @@
         </w:rPr>
       </w:sdtEndPr>
       <w:sdtContent>
-        <w:customXmlInsRangeEnd w:id="374"/>
+        <w:customXmlInsRangeEnd w:id="369"/>
         <w:p>
           <w:pPr>
             <w:pStyle w:val="Ttulo1"/>
             <w:rPr>
-              <w:ins w:id="376" w:author="Eduardo Flach" w:date="2026-10-21T20:25:00Z"/>
+              <w:ins w:id="371" w:author="Eduardo Flach" w:date="2026-10-21T20:25:00Z"/>
             </w:rPr>
           </w:pPr>
-          <w:ins w:id="377" w:author="Eduardo Flach" w:date="2026-10-21T20:25:00Z">
-            <w:r>
-              <w:rPr>
-                <w:rPrChange w:id="378" w:author="Eduardo Flach" w:date="2026-10-23T09:15:00Z">
+          <w:ins w:id="372" w:author="Eduardo Flach" w:date="2026-10-21T20:25:00Z">
+            <w:r>
+              <w:rPr>
+                <w:rPrChange w:id="373" w:author="Eduardo Flach" w:date="2026-10-23T09:15:00Z">
                   <w:rPr>
                     <w:lang w:val="pt-BR"/>
                   </w:rPr>
@@ -6100,209 +6622,55 @@
               </w:rPr>
               <w:t>References</w:t>
             </w:r>
-            <w:bookmarkEnd w:id="375"/>
+            <w:bookmarkEnd w:id="370"/>
           </w:ins>
         </w:p>
-        <w:customXmlInsRangeStart w:id="379" w:author="Eduardo Flach" w:date="2026-10-21T20:25:00Z"/>
+        <w:customXmlInsRangeStart w:id="374" w:author="Eduardo Flach" w:date="2026-10-21T20:25:00Z"/>
         <w:sdt>
           <w:sdtPr>
             <w:id w:val="111145805"/>
+            <w:showingPlcHdr/>
             <w:bibliography/>
           </w:sdtPr>
           <w:sdtContent>
-            <w:customXmlInsRangeEnd w:id="379"/>
+            <w:customXmlInsRangeEnd w:id="374"/>
             <w:p>
               <w:pPr>
                 <w:pStyle w:val="Bibliografia"/>
                 <w:rPr>
+                  <w:ins w:id="375" w:author="Eduardo Flach" w:date="2026-10-21T20:25:00Z"/>
                   <w:noProof/>
                   <w:sz w:val="24"/>
                   <w:szCs w:val="24"/>
                 </w:rPr>
               </w:pPr>
-              <w:ins w:id="380" w:author="Eduardo Flach" w:date="2026-10-21T20:25:00Z">
-                <w:r>
-                  <w:fldChar w:fldCharType="begin"/>
-                </w:r>
-                <w:r>
-                  <w:instrText>BIBLIOGRAPHY</w:instrText>
-                </w:r>
-                <w:r>
-                  <w:fldChar w:fldCharType="separate"/>
-                </w:r>
-              </w:ins>
               <w:r>
-                <w:rPr>
-                  <w:noProof/>
-                </w:rPr>
-                <w:t xml:space="preserve">Bernritter, S. K. P. a. S. F., 2021. Behaviorally targeted location-based mobile marketing’. </w:t>
-              </w:r>
-              <w:r>
-                <w:rPr>
-                  <w:i/>
-                  <w:iCs/>
-                  <w:noProof/>
-                </w:rPr>
-                <w:t>Journal of the Academy of Marketing Science</w:t>
-              </w:r>
-              <w:r>
-                <w:rPr>
-                  <w:noProof/>
-                </w:rPr>
-                <w:t>, p. 49:677–702.</w:t>
+                <w:t xml:space="preserve">     </w:t>
               </w:r>
             </w:p>
-            <w:p>
-              <w:pPr>
-                <w:pStyle w:val="Bibliografia"/>
-                <w:rPr>
-                  <w:noProof/>
-                </w:rPr>
-              </w:pPr>
-              <w:r>
-                <w:rPr>
-                  <w:noProof/>
-                </w:rPr>
-                <w:t xml:space="preserve">Günther, L. C. C. E. W. H.-H. B. C., 2019. Data quality assessment for improved decision-making: a methodology for small and medium-sized enterprises. </w:t>
-              </w:r>
-              <w:r>
-                <w:rPr>
-                  <w:i/>
-                  <w:iCs/>
-                  <w:noProof/>
-                </w:rPr>
-                <w:t>Procedia Manufacturing</w:t>
-              </w:r>
-              <w:r>
-                <w:rPr>
-                  <w:noProof/>
-                </w:rPr>
-                <w:t>, p. 583–591.</w:t>
-              </w:r>
-            </w:p>
-            <w:p>
-              <w:pPr>
-                <w:pStyle w:val="Bibliografia"/>
-                <w:rPr>
-                  <w:noProof/>
-                </w:rPr>
-              </w:pPr>
-              <w:r>
-                <w:rPr>
-                  <w:noProof/>
-                </w:rPr>
-                <w:t xml:space="preserve">Koukaras, P. a. T. C., 2025. Data Preprocessing and Feature Engineering for Data Mining: Techniques, Tools, and Best Practices. </w:t>
-              </w:r>
-              <w:r>
-                <w:rPr>
-                  <w:i/>
-                  <w:iCs/>
-                  <w:noProof/>
-                </w:rPr>
-                <w:t>AI</w:t>
-              </w:r>
-              <w:r>
-                <w:rPr>
-                  <w:noProof/>
-                </w:rPr>
-                <w:t>, pp. 6(10), article 257.</w:t>
-              </w:r>
-            </w:p>
-            <w:p>
-              <w:pPr>
-                <w:pStyle w:val="Bibliografia"/>
-                <w:rPr>
-                  <w:noProof/>
-                </w:rPr>
-              </w:pPr>
-              <w:r>
-                <w:rPr>
-                  <w:noProof/>
-                </w:rPr>
-                <w:t xml:space="preserve">Patrick ULRICH, W. B. A. F. E. R., 2018. Data Analytics Systems and SME type - a Design Science Approach. </w:t>
-              </w:r>
-              <w:r>
-                <w:rPr>
-                  <w:i/>
-                  <w:iCs/>
-                  <w:noProof/>
-                </w:rPr>
-                <w:t>ScienceDirect</w:t>
-              </w:r>
-              <w:r>
-                <w:rPr>
-                  <w:noProof/>
-                </w:rPr>
-                <w:t>, p. 1162–1170.</w:t>
-              </w:r>
-            </w:p>
-            <w:p>
-              <w:pPr>
-                <w:pStyle w:val="Bibliografia"/>
-                <w:rPr>
-                  <w:noProof/>
-                </w:rPr>
-              </w:pPr>
-              <w:r>
-                <w:rPr>
-                  <w:noProof/>
-                </w:rPr>
-                <w:t xml:space="preserve">Rainio, O. T. J. a. K. R., 2024. Evaluation metrics and statistical tests for machine learning. </w:t>
-              </w:r>
-              <w:r>
-                <w:rPr>
-                  <w:i/>
-                  <w:iCs/>
-                  <w:noProof/>
-                </w:rPr>
-                <w:t>Scientific Reports</w:t>
-              </w:r>
-              <w:r>
-                <w:rPr>
-                  <w:noProof/>
-                </w:rPr>
-                <w:t>, pp. 14, article 6086.</w:t>
-              </w:r>
-            </w:p>
-            <w:p>
-              <w:pPr>
-                <w:rPr>
-                  <w:ins w:id="381" w:author="Eduardo Flach" w:date="2026-10-21T20:25:00Z"/>
-                </w:rPr>
-              </w:pPr>
-              <w:ins w:id="382" w:author="Eduardo Flach" w:date="2026-10-21T20:25:00Z">
-                <w:r>
-                  <w:rPr>
-                    <w:b/>
-                    <w:bCs/>
-                  </w:rPr>
-                  <w:fldChar w:fldCharType="end"/>
-                </w:r>
-              </w:ins>
-            </w:p>
-            <w:customXmlInsRangeStart w:id="383" w:author="Eduardo Flach" w:date="2026-10-21T20:25:00Z"/>
+            <w:customXmlInsRangeStart w:id="376" w:author="Eduardo Flach" w:date="2026-10-21T20:25:00Z"/>
           </w:sdtContent>
         </w:sdt>
-        <w:customXmlInsRangeEnd w:id="383"/>
-        <w:customXmlInsRangeStart w:id="384" w:author="Eduardo Flach" w:date="2026-10-21T20:25:00Z"/>
+        <w:customXmlInsRangeEnd w:id="376"/>
+        <w:customXmlInsRangeStart w:id="377" w:author="Eduardo Flach" w:date="2026-10-21T20:25:00Z"/>
       </w:sdtContent>
     </w:sdt>
-    <w:customXmlInsRangeEnd w:id="384"/>
-    <w:p>
-      <w:pPr>
-        <w:rPr>
-          <w:del w:id="385" w:author="Eduardo Flach" w:date="2026-10-21T20:24:00Z"/>
-        </w:rPr>
-      </w:pPr>
-    </w:p>
-    <w:p>
-      <w:pPr>
-        <w:rPr>
-          <w:del w:id="386" w:author="Eduardo Flach" w:date="2026-10-21T20:24:00Z"/>
+    <w:customXmlInsRangeEnd w:id="377"/>
+    <w:p>
+      <w:pPr>
+        <w:rPr>
+          <w:del w:id="378" w:author="Eduardo Flach" w:date="2026-10-21T20:24:00Z"/>
+        </w:rPr>
+      </w:pPr>
+    </w:p>
+    <w:p>
+      <w:pPr>
+        <w:rPr>
+          <w:del w:id="379" w:author="Eduardo Flach" w:date="2026-10-21T20:24:00Z"/>
           <w:color w:val="FF0000"/>
         </w:rPr>
       </w:pPr>
-      <w:del w:id="387" w:author="Eduardo Flach" w:date="2026-10-21T20:24:00Z">
+      <w:del w:id="380" w:author="Eduardo Flach" w:date="2026-10-21T20:24:00Z">
         <w:r>
           <w:rPr>
             <w:color w:val="FF0000"/>
@@ -6323,56 +6691,56 @@
     <w:p>
       <w:pPr>
         <w:rPr>
+          <w:del w:id="381" w:author="Eduardo Flach" w:date="2026-10-23T09:23:00Z"/>
+        </w:rPr>
+      </w:pPr>
+    </w:p>
+    <w:p>
+      <w:pPr>
+        <w:rPr>
+          <w:del w:id="382" w:author="Eduardo Flach" w:date="2026-10-23T09:23:00Z"/>
+        </w:rPr>
+      </w:pPr>
+    </w:p>
+    <w:p>
+      <w:pPr>
+        <w:rPr>
+          <w:del w:id="383" w:author="Eduardo Flach" w:date="2026-10-23T09:23:00Z"/>
+        </w:rPr>
+      </w:pPr>
+    </w:p>
+    <w:p>
+      <w:pPr>
+        <w:rPr>
+          <w:del w:id="384" w:author="Eduardo Flach" w:date="2026-10-23T09:23:00Z"/>
+        </w:rPr>
+      </w:pPr>
+    </w:p>
+    <w:p>
+      <w:pPr>
+        <w:rPr>
+          <w:del w:id="385" w:author="Eduardo Flach" w:date="2026-10-23T09:23:00Z"/>
+        </w:rPr>
+      </w:pPr>
+    </w:p>
+    <w:p>
+      <w:pPr>
+        <w:rPr>
+          <w:del w:id="386" w:author="Eduardo Flach" w:date="2026-10-23T09:23:00Z"/>
+        </w:rPr>
+      </w:pPr>
+    </w:p>
+    <w:p>
+      <w:pPr>
+        <w:rPr>
+          <w:del w:id="387" w:author="Eduardo Flach" w:date="2026-10-23T09:23:00Z"/>
+        </w:rPr>
+      </w:pPr>
+    </w:p>
+    <w:p>
+      <w:pPr>
+        <w:rPr>
           <w:del w:id="388" w:author="Eduardo Flach" w:date="2026-10-23T09:23:00Z"/>
-        </w:rPr>
-      </w:pPr>
-    </w:p>
-    <w:p>
-      <w:pPr>
-        <w:rPr>
-          <w:del w:id="389" w:author="Eduardo Flach" w:date="2026-10-23T09:23:00Z"/>
-        </w:rPr>
-      </w:pPr>
-    </w:p>
-    <w:p>
-      <w:pPr>
-        <w:rPr>
-          <w:del w:id="390" w:author="Eduardo Flach" w:date="2026-10-23T09:23:00Z"/>
-        </w:rPr>
-      </w:pPr>
-    </w:p>
-    <w:p>
-      <w:pPr>
-        <w:rPr>
-          <w:del w:id="391" w:author="Eduardo Flach" w:date="2026-10-23T09:23:00Z"/>
-        </w:rPr>
-      </w:pPr>
-    </w:p>
-    <w:p>
-      <w:pPr>
-        <w:rPr>
-          <w:del w:id="392" w:author="Eduardo Flach" w:date="2026-10-23T09:23:00Z"/>
-        </w:rPr>
-      </w:pPr>
-    </w:p>
-    <w:p>
-      <w:pPr>
-        <w:rPr>
-          <w:del w:id="393" w:author="Eduardo Flach" w:date="2026-10-23T09:23:00Z"/>
-        </w:rPr>
-      </w:pPr>
-    </w:p>
-    <w:p>
-      <w:pPr>
-        <w:rPr>
-          <w:del w:id="394" w:author="Eduardo Flach" w:date="2026-10-23T09:23:00Z"/>
-        </w:rPr>
-      </w:pPr>
-    </w:p>
-    <w:p>
-      <w:pPr>
-        <w:rPr>
-          <w:del w:id="395" w:author="Eduardo Flach" w:date="2026-10-23T09:23:00Z"/>
         </w:rPr>
       </w:pPr>
     </w:p>
@@ -6387,8 +6755,57 @@
         </w:pBdr>
         <w:spacing w:after="0" w:line="240" w:lineRule="auto"/>
         <w:rPr>
+          <w:del w:id="389" w:author="Eduardo Flach" w:date="2026-10-23T09:23:00Z"/>
+          <w:color w:val="000000"/>
+        </w:rPr>
+      </w:pPr>
+    </w:p>
+    <w:p>
+      <w:pPr>
+        <w:rPr>
+          <w:del w:id="390" w:author="Eduardo Flach" w:date="2026-10-23T09:23:00Z"/>
+        </w:rPr>
+      </w:pPr>
+    </w:p>
+    <w:p>
+      <w:pPr>
+        <w:rPr>
+          <w:del w:id="391" w:author="Eduardo Flach" w:date="2026-10-23T09:23:00Z"/>
+        </w:rPr>
+      </w:pPr>
+    </w:p>
+    <w:p>
+      <w:pPr>
+        <w:rPr>
+          <w:del w:id="392" w:author="Eduardo Flach" w:date="2026-10-23T09:23:00Z"/>
+        </w:rPr>
+      </w:pPr>
+    </w:p>
+    <w:p>
+      <w:pPr>
+        <w:rPr>
+          <w:del w:id="393" w:author="Eduardo Flach" w:date="2026-10-23T09:23:00Z"/>
+        </w:rPr>
+      </w:pPr>
+    </w:p>
+    <w:p>
+      <w:pPr>
+        <w:rPr>
+          <w:del w:id="394" w:author="Eduardo Flach" w:date="2026-10-23T09:23:00Z"/>
+        </w:rPr>
+      </w:pPr>
+    </w:p>
+    <w:p>
+      <w:pPr>
+        <w:rPr>
+          <w:del w:id="395" w:author="Eduardo Flach" w:date="2026-10-23T09:23:00Z"/>
+        </w:rPr>
+      </w:pPr>
+    </w:p>
+    <w:p>
+      <w:pPr>
+        <w:rPr>
           <w:del w:id="396" w:author="Eduardo Flach" w:date="2026-10-23T09:23:00Z"/>
-          <w:color w:val="000000"/>
         </w:rPr>
       </w:pPr>
     </w:p>
@@ -6415,24 +6832,18 @@
     </w:p>
     <w:p>
       <w:pPr>
+        <w:pStyle w:val="Ttulo1"/>
         <w:rPr>
           <w:del w:id="400" w:author="Eduardo Flach" w:date="2026-10-23T09:23:00Z"/>
         </w:rPr>
       </w:pPr>
-    </w:p>
-    <w:p>
-      <w:pPr>
-        <w:rPr>
-          <w:del w:id="401" w:author="Eduardo Flach" w:date="2026-10-23T09:23:00Z"/>
-        </w:rPr>
-      </w:pPr>
-    </w:p>
-    <w:p>
-      <w:pPr>
-        <w:rPr>
-          <w:del w:id="402" w:author="Eduardo Flach" w:date="2026-10-23T09:23:00Z"/>
-        </w:rPr>
-      </w:pPr>
+      <w:bookmarkStart w:id="401" w:name="_heading=h.kfkjs3rwl2c1" w:colFirst="0" w:colLast="0"/>
+      <w:bookmarkEnd w:id="401"/>
+      <w:del w:id="402" w:author="Eduardo Flach" w:date="2026-10-23T09:23:00Z">
+        <w:r>
+          <w:delText>Appendix</w:delText>
+        </w:r>
+      </w:del>
     </w:p>
     <w:p>
       <w:pPr>
@@ -6445,6 +6856,7 @@
       <w:pPr>
         <w:rPr>
           <w:del w:id="404" w:author="Eduardo Flach" w:date="2026-10-23T09:23:00Z"/>
+          <w:color w:val="FF0000"/>
         </w:rPr>
       </w:pPr>
     </w:p>
@@ -6452,86 +6864,42 @@
       <w:pPr>
         <w:rPr>
           <w:del w:id="405" w:author="Eduardo Flach" w:date="2026-10-23T09:23:00Z"/>
-        </w:rPr>
-      </w:pPr>
-    </w:p>
-    <w:p>
-      <w:pPr>
-        <w:rPr>
-          <w:del w:id="406" w:author="Eduardo Flach" w:date="2026-10-23T09:23:00Z"/>
-        </w:rPr>
-      </w:pPr>
-    </w:p>
-    <w:p>
-      <w:pPr>
-        <w:pStyle w:val="Ttulo1"/>
+          <w:color w:val="FF0000"/>
+        </w:rPr>
+      </w:pPr>
+      <w:del w:id="406" w:author="Eduardo Flach" w:date="2026-10-23T09:23:00Z">
+        <w:r>
+          <w:rPr>
+            <w:color w:val="FF0000"/>
+          </w:rPr>
+          <w:delText xml:space="preserve">If you have used AI tools in your work, you must include screenshots of your requests in the appendix. </w:delText>
+        </w:r>
+      </w:del>
+    </w:p>
+    <w:p>
+      <w:pPr>
         <w:rPr>
           <w:del w:id="407" w:author="Eduardo Flach" w:date="2026-10-23T09:23:00Z"/>
-        </w:rPr>
-      </w:pPr>
-      <w:bookmarkStart w:id="408" w:name="_heading=h.kfkjs3rwl2c1" w:colFirst="0" w:colLast="0"/>
-      <w:bookmarkEnd w:id="408"/>
-      <w:del w:id="409" w:author="Eduardo Flach" w:date="2026-10-23T09:23:00Z">
-        <w:r>
-          <w:delText>Appendix</w:delText>
+          <w:color w:val="FF0000"/>
+        </w:rPr>
+      </w:pPr>
+      <w:del w:id="408" w:author="Eduardo Flach" w:date="2026-10-23T09:23:00Z">
+        <w:r>
+          <w:rPr>
+            <w:color w:val="FF0000"/>
+          </w:rPr>
+          <w:delText>The appendix serves as a repository for additional or supplementary information that is deemed too extensive or detailed for integration into the main body of the text. This supplementary content can encompass data tables, charts, graphs, questionnaires, or any other supporting materials that contribute to a comprehensive understanding of the research.</w:delText>
         </w:r>
       </w:del>
     </w:p>
     <w:p>
       <w:pPr>
         <w:rPr>
-          <w:del w:id="410" w:author="Eduardo Flach" w:date="2026-10-23T09:23:00Z"/>
-        </w:rPr>
-      </w:pPr>
-    </w:p>
-    <w:p>
-      <w:pPr>
-        <w:rPr>
-          <w:del w:id="411" w:author="Eduardo Flach" w:date="2026-10-23T09:23:00Z"/>
+          <w:del w:id="409" w:author="Eduardo Flach" w:date="2026-10-23T09:23:00Z"/>
           <w:color w:val="FF0000"/>
         </w:rPr>
       </w:pPr>
-    </w:p>
-    <w:p>
-      <w:pPr>
-        <w:rPr>
-          <w:del w:id="412" w:author="Eduardo Flach" w:date="2026-10-23T09:23:00Z"/>
-          <w:color w:val="FF0000"/>
-        </w:rPr>
-      </w:pPr>
-      <w:del w:id="413" w:author="Eduardo Flach" w:date="2026-10-23T09:23:00Z">
-        <w:r>
-          <w:rPr>
-            <w:color w:val="FF0000"/>
-          </w:rPr>
-          <w:delText xml:space="preserve">If you have used AI tools in your work, you must include screenshots of your requests in the appendix. </w:delText>
-        </w:r>
-      </w:del>
-    </w:p>
-    <w:p>
-      <w:pPr>
-        <w:rPr>
-          <w:del w:id="414" w:author="Eduardo Flach" w:date="2026-10-23T09:23:00Z"/>
-          <w:color w:val="FF0000"/>
-        </w:rPr>
-      </w:pPr>
-      <w:del w:id="415" w:author="Eduardo Flach" w:date="2026-10-23T09:23:00Z">
-        <w:r>
-          <w:rPr>
-            <w:color w:val="FF0000"/>
-          </w:rPr>
-          <w:delText>The appendix serves as a repository for additional or supplementary information that is deemed too extensive or detailed for integration into the main body of the text. This supplementary content can encompass data tables, charts, graphs, questionnaires, or any other supporting materials that contribute to a comprehensive understanding of the research.</w:delText>
-        </w:r>
-      </w:del>
-    </w:p>
-    <w:p>
-      <w:pPr>
-        <w:rPr>
-          <w:del w:id="416" w:author="Eduardo Flach" w:date="2026-10-23T09:23:00Z"/>
-          <w:color w:val="FF0000"/>
-        </w:rPr>
-      </w:pPr>
-      <w:del w:id="417" w:author="Eduardo Flach" w:date="2026-10-23T09:23:00Z">
+      <w:del w:id="410" w:author="Eduardo Flach" w:date="2026-10-23T09:23:00Z">
         <w:r>
           <w:rPr>
             <w:color w:val="FF0000"/>
@@ -6549,7 +6917,7 @@
     </w:p>
     <w:p/>
     <w:sectPr>
-      <w:footerReference w:type="default" r:id="rId16"/>
+      <w:footerReference w:type="default" r:id="rId22"/>
       <w:pgSz w:w="11906" w:h="16838"/>
       <w:pgMar w:top="1440" w:right="1440" w:bottom="1440" w:left="1440" w:header="708" w:footer="708" w:gutter="0"/>
       <w:pgNumType w:start="1"/>
@@ -9011,6 +9379,140 @@
 </file>
 
 <file path=customXml/item1.xml><?xml version="1.0" encoding="utf-8"?>
+<?mso-contentType ?>
+<FormTemplates xmlns="http://schemas.microsoft.com/sharepoint/v3/contenttype/forms">
+  <Display>DocumentLibraryForm</Display>
+  <Edit>DocumentLibraryForm</Edit>
+  <New>DocumentLibraryForm</New>
+</FormTemplates>
+</file>
+
+<file path=customXml/item2.xml><?xml version="1.0" encoding="utf-8"?>
+<p:properties xmlns:p="http://schemas.microsoft.com/office/2006/metadata/properties" xmlns:xsi="http://www.w3.org/2001/XMLSchema-instance" xmlns:pc="http://schemas.microsoft.com/office/infopath/2007/PartnerControls">
+  <documentManagement>
+    <_activity xmlns="b16a9495-4dfd-42d3-807b-98cb11f03b43" xsi:nil="true"/>
+  </documentManagement>
+</p:properties>
+</file>
+
+<file path=customXml/item3.xml><?xml version="1.0" encoding="utf-8"?>
+<go:gDocsCustomXmlDataStorage xmlns:go="http://customooxmlschemas.google.com/" xmlns:r="http://schemas.openxmlformats.org/officeDocument/2006/relationships" uri="GoogleDocsCustomDataVersion2">
+  <go:docsCustomData xmlns:go="http://customooxmlschemas.google.com/" roundtripDataSignature="AMtx7miehlgh2pzFvkmpnhkVaeODs3Wnuw==">CgMxLjAyCGguZ2pkZ3hzMgloLjMwajB6bGwyCWguMWZvYjl0ZTIJaC4zem55c2g3MgloLjJldDkycDAyDmgua2ZranMzcndsMmMxOAByITF6bEVRVXYyWkdtTjZWemdfYk5uaGpmb0x1c2hhYUo3dw==</go:docsCustomData>
+</go:gDocsCustomXmlDataStorage>
+</file>
+
+<file path=customXml/item4.xml><?xml version="1.0" encoding="utf-8"?>
+<b:Sources xmlns:b="http://schemas.openxmlformats.org/officeDocument/2006/bibliography" xmlns="http://schemas.openxmlformats.org/officeDocument/2006/bibliography" SelectedStyle="\HarvardAnglia2008OfficeOnline.xsl" StyleName="Harvard - Anglia" Version="2008">
+  <b:Source>
+    <b:Tag>Pat18</b:Tag>
+    <b:SourceType>ArticleInAPeriodical</b:SourceType>
+    <b:Guid>{5B52B951-322D-4CCD-8748-31433AF64BBC}</b:Guid>
+    <b:Title>Data Analytics Systems and SME type - a Design Science Approach</b:Title>
+    <b:Year>2018</b:Year>
+    <b:LCID>en-IE</b:LCID>
+    <b:Author>
+      <b:Author>
+        <b:NameList>
+          <b:Person>
+            <b:Last>Patrick ULRICH</b:Last>
+            <b:First>Wolfgang</b:First>
+            <b:Middle>BECKER, Alexandra FIBITZ, Eva REITELSHÖFER</b:Middle>
+          </b:Person>
+        </b:NameList>
+      </b:Author>
+    </b:Author>
+    <b:PeriodicalTitle>ScienceDirect</b:PeriodicalTitle>
+    <b:Pages>1162–1170</b:Pages>
+    <b:RefOrder>1</b:RefOrder>
+  </b:Source>
+  <b:Source>
+    <b:Tag>Gün19</b:Tag>
+    <b:SourceType>ArticleInAPeriodical</b:SourceType>
+    <b:Guid>{8B29ADD7-CF57-41D6-8460-C908A42EA451}</b:Guid>
+    <b:Author>
+      <b:Author>
+        <b:NameList>
+          <b:Person>
+            <b:Last>Günther</b:Last>
+            <b:First>Lisa</b:First>
+            <b:Middle>C., Colangelo, Eduardo, Wiendahl, Hans-Hermann, Bauer, Christian</b:Middle>
+          </b:Person>
+        </b:NameList>
+      </b:Author>
+    </b:Author>
+    <b:Title>Data quality assessment for improved decision-making: a methodology for small and medium-sized enterprises</b:Title>
+    <b:PeriodicalTitle>Procedia Manufacturing</b:PeriodicalTitle>
+    <b:Year>2019</b:Year>
+    <b:Pages>583–591</b:Pages>
+    <b:RefOrder>2</b:RefOrder>
+  </b:Source>
+  <b:Source>
+    <b:Tag>Ber21</b:Tag>
+    <b:SourceType>ArticleInAPeriodical</b:SourceType>
+    <b:Guid>{1F06AFAC-C1ED-469E-AF8B-13855CC9A64D}</b:Guid>
+    <b:Author>
+      <b:Author>
+        <b:NameList>
+          <b:Person>
+            <b:Last>Bernritter</b:Last>
+            <b:First>S.F.,</b:First>
+            <b:Middle>Ketelaar, P.E. and Sotgiu, F.</b:Middle>
+          </b:Person>
+        </b:NameList>
+      </b:Author>
+    </b:Author>
+    <b:Title>Behaviorally targeted location-based mobile marketing’</b:Title>
+    <b:PeriodicalTitle>Journal of the Academy of Marketing Science</b:PeriodicalTitle>
+    <b:Year>2021</b:Year>
+    <b:Pages>49:677–702</b:Pages>
+    <b:RefOrder>3</b:RefOrder>
+  </b:Source>
+  <b:Source>
+    <b:Tag>Kou25</b:Tag>
+    <b:SourceType>ArticleInAPeriodical</b:SourceType>
+    <b:Guid>{C393AD5F-0069-4179-8234-F93FBBB5DFB7}</b:Guid>
+    <b:Author>
+      <b:Author>
+        <b:NameList>
+          <b:Person>
+            <b:Last>Koukaras</b:Last>
+            <b:First>P.</b:First>
+            <b:Middle>and Tjortjis, C</b:Middle>
+          </b:Person>
+        </b:NameList>
+      </b:Author>
+    </b:Author>
+    <b:Title>Data Preprocessing and Feature Engineering for Data Mining: Techniques, Tools, and Best Practices</b:Title>
+    <b:PeriodicalTitle>AI</b:PeriodicalTitle>
+    <b:Year>2025</b:Year>
+    <b:Pages>6(10), article 257</b:Pages>
+    <b:RefOrder>4</b:RefOrder>
+  </b:Source>
+  <b:Source>
+    <b:Tag>Rai24</b:Tag>
+    <b:SourceType>ArticleInAPeriodical</b:SourceType>
+    <b:Guid>{785222AB-46C8-4C86-9F7A-DB716234C270}</b:Guid>
+    <b:Author>
+      <b:Author>
+        <b:NameList>
+          <b:Person>
+            <b:Last>Rainio</b:Last>
+            <b:First>O.,</b:First>
+            <b:Middle>Teuho, J. and Klén, R.</b:Middle>
+          </b:Person>
+        </b:NameList>
+      </b:Author>
+    </b:Author>
+    <b:Title>Evaluation metrics and statistical tests for machine learning</b:Title>
+    <b:PeriodicalTitle>Scientific Reports</b:PeriodicalTitle>
+    <b:Year>2024</b:Year>
+    <b:Pages>14, article 6086</b:Pages>
+    <b:RefOrder>5</b:RefOrder>
+  </b:Source>
+</b:Sources>
+</file>
+
+<file path=customXml/item5.xml><?xml version="1.0" encoding="utf-8"?>
 <ct:contentTypeSchema xmlns:ct="http://schemas.microsoft.com/office/2006/metadata/contentType" xmlns:ma="http://schemas.microsoft.com/office/2006/metadata/properties/metaAttributes" ct:_="" ma:_="" ma:contentTypeName="Document" ma:contentTypeID="0x01010091CA7052A48FB44E8BAE44044031FC77" ma:contentTypeVersion="5" ma:contentTypeDescription="Create a new document." ma:contentTypeScope="" ma:versionID="72110da391d7bf7bbbd9879cda66318c">
   <xsd:schema xmlns:xsd="http://www.w3.org/2001/XMLSchema" xmlns:xs="http://www.w3.org/2001/XMLSchema" xmlns:p="http://schemas.microsoft.com/office/2006/metadata/properties" xmlns:ns3="b16a9495-4dfd-42d3-807b-98cb11f03b43" targetNamespace="http://schemas.microsoft.com/office/2006/metadata/properties" ma:root="true" ma:fieldsID="65d4c4ab10123b5e2192ffab3149626d" ns3:_="">
     <xsd:import namespace="b16a9495-4dfd-42d3-807b-98cb11f03b43"/>
@@ -9160,141 +9662,42 @@
 </ct:contentTypeSchema>
 </file>
 
-<file path=customXml/item2.xml><?xml version="1.0" encoding="utf-8"?>
-<b:Sources xmlns:b="http://schemas.openxmlformats.org/officeDocument/2006/bibliography" xmlns="http://schemas.openxmlformats.org/officeDocument/2006/bibliography" SelectedStyle="\HarvardAnglia2008OfficeOnline.xsl" StyleName="Harvard - Anglia" Version="2008">
-  <b:Source>
-    <b:Tag>Pat18</b:Tag>
-    <b:SourceType>ArticleInAPeriodical</b:SourceType>
-    <b:Guid>{5B52B951-322D-4CCD-8748-31433AF64BBC}</b:Guid>
-    <b:Title>Data Analytics Systems and SME type - a Design Science Approach</b:Title>
-    <b:Year>2018</b:Year>
-    <b:LCID>en-IE</b:LCID>
-    <b:Author>
-      <b:Author>
-        <b:NameList>
-          <b:Person>
-            <b:Last>Patrick ULRICH</b:Last>
-            <b:First>Wolfgang</b:First>
-            <b:Middle>BECKER, Alexandra FIBITZ, Eva REITELSHÖFER</b:Middle>
-          </b:Person>
-        </b:NameList>
-      </b:Author>
-    </b:Author>
-    <b:PeriodicalTitle>ScienceDirect</b:PeriodicalTitle>
-    <b:Pages>1162–1170</b:Pages>
-    <b:RefOrder>1</b:RefOrder>
-  </b:Source>
-  <b:Source>
-    <b:Tag>Gün19</b:Tag>
-    <b:SourceType>ArticleInAPeriodical</b:SourceType>
-    <b:Guid>{8B29ADD7-CF57-41D6-8460-C908A42EA451}</b:Guid>
-    <b:Author>
-      <b:Author>
-        <b:NameList>
-          <b:Person>
-            <b:Last>Günther</b:Last>
-            <b:First>Lisa</b:First>
-            <b:Middle>C., Colangelo, Eduardo, Wiendahl, Hans-Hermann, Bauer, Christian</b:Middle>
-          </b:Person>
-        </b:NameList>
-      </b:Author>
-    </b:Author>
-    <b:Title>Data quality assessment for improved decision-making: a methodology for small and medium-sized enterprises</b:Title>
-    <b:PeriodicalTitle>Procedia Manufacturing</b:PeriodicalTitle>
-    <b:Year>2019</b:Year>
-    <b:Pages>583–591</b:Pages>
-    <b:RefOrder>2</b:RefOrder>
-  </b:Source>
-  <b:Source>
-    <b:Tag>Ber21</b:Tag>
-    <b:SourceType>ArticleInAPeriodical</b:SourceType>
-    <b:Guid>{1F06AFAC-C1ED-469E-AF8B-13855CC9A64D}</b:Guid>
-    <b:Author>
-      <b:Author>
-        <b:NameList>
-          <b:Person>
-            <b:Last>Bernritter</b:Last>
-            <b:First>S.F.,</b:First>
-            <b:Middle>Ketelaar, P.E. and Sotgiu, F.</b:Middle>
-          </b:Person>
-        </b:NameList>
-      </b:Author>
-    </b:Author>
-    <b:Title>Behaviorally targeted location-based mobile marketing’</b:Title>
-    <b:PeriodicalTitle>Journal of the Academy of Marketing Science</b:PeriodicalTitle>
-    <b:Year>2021</b:Year>
-    <b:Pages>49:677–702</b:Pages>
-    <b:RefOrder>3</b:RefOrder>
-  </b:Source>
-  <b:Source>
-    <b:Tag>Kou25</b:Tag>
-    <b:SourceType>ArticleInAPeriodical</b:SourceType>
-    <b:Guid>{C393AD5F-0069-4179-8234-F93FBBB5DFB7}</b:Guid>
-    <b:Author>
-      <b:Author>
-        <b:NameList>
-          <b:Person>
-            <b:Last>Koukaras</b:Last>
-            <b:First>P.</b:First>
-            <b:Middle>and Tjortjis, C</b:Middle>
-          </b:Person>
-        </b:NameList>
-      </b:Author>
-    </b:Author>
-    <b:Title>Data Preprocessing and Feature Engineering for Data Mining: Techniques, Tools, and Best Practices</b:Title>
-    <b:PeriodicalTitle>AI</b:PeriodicalTitle>
-    <b:Year>2025</b:Year>
-    <b:Pages>6(10), article 257</b:Pages>
-    <b:RefOrder>4</b:RefOrder>
-  </b:Source>
-  <b:Source>
-    <b:Tag>Rai24</b:Tag>
-    <b:SourceType>ArticleInAPeriodical</b:SourceType>
-    <b:Guid>{785222AB-46C8-4C86-9F7A-DB716234C270}</b:Guid>
-    <b:Author>
-      <b:Author>
-        <b:NameList>
-          <b:Person>
-            <b:Last>Rainio</b:Last>
-            <b:First>O.,</b:First>
-            <b:Middle>Teuho, J. and Klén, R.</b:Middle>
-          </b:Person>
-        </b:NameList>
-      </b:Author>
-    </b:Author>
-    <b:Title>Evaluation metrics and statistical tests for machine learning</b:Title>
-    <b:PeriodicalTitle>Scientific Reports</b:PeriodicalTitle>
-    <b:Year>2024</b:Year>
-    <b:Pages>14, article 6086</b:Pages>
-    <b:RefOrder>5</b:RefOrder>
-  </b:Source>
-</b:Sources>
+<file path=customXml/itemProps1.xml><?xml version="1.0" encoding="utf-8"?>
+<ds:datastoreItem xmlns:ds="http://schemas.openxmlformats.org/officeDocument/2006/customXml" ds:itemID="{AD64260C-1345-4C21-A804-B9FBE7B91489}">
+  <ds:schemaRefs>
+    <ds:schemaRef ds:uri="http://schemas.microsoft.com/sharepoint/v3/contenttype/forms"/>
+  </ds:schemaRefs>
+</ds:datastoreItem>
 </file>
 
-<file path=customXml/item3.xml><?xml version="1.0" encoding="utf-8"?>
-<go:gDocsCustomXmlDataStorage xmlns:go="http://customooxmlschemas.google.com/" xmlns:r="http://schemas.openxmlformats.org/officeDocument/2006/relationships" uri="GoogleDocsCustomDataVersion2">
-  <go:docsCustomData xmlns:go="http://customooxmlschemas.google.com/" roundtripDataSignature="AMtx7miehlgh2pzFvkmpnhkVaeODs3Wnuw==">CgMxLjAyCGguZ2pkZ3hzMgloLjMwajB6bGwyCWguMWZvYjl0ZTIJaC4zem55c2g3MgloLjJldDkycDAyDmgua2ZranMzcndsMmMxOAByITF6bEVRVXYyWkdtTjZWemdfYk5uaGpmb0x1c2hhYUo3dw==</go:docsCustomData>
-</go:gDocsCustomXmlDataStorage>
+<file path=customXml/itemProps2.xml><?xml version="1.0" encoding="utf-8"?>
+<ds:datastoreItem xmlns:ds="http://schemas.openxmlformats.org/officeDocument/2006/customXml" ds:itemID="{D51EB97A-8C7A-4EE1-A3AD-E57FDBFA6BEE}">
+  <ds:schemaRefs>
+    <ds:schemaRef ds:uri="http://schemas.microsoft.com/office/2006/metadata/properties"/>
+    <ds:schemaRef ds:uri="http://schemas.microsoft.com/office/infopath/2007/PartnerControls"/>
+    <ds:schemaRef ds:uri="b16a9495-4dfd-42d3-807b-98cb11f03b43"/>
+  </ds:schemaRefs>
+</ds:datastoreItem>
 </file>
 
-<file path=customXml/item4.xml><?xml version="1.0" encoding="utf-8"?>
-<p:properties xmlns:p="http://schemas.microsoft.com/office/2006/metadata/properties" xmlns:xsi="http://www.w3.org/2001/XMLSchema-instance" xmlns:pc="http://schemas.microsoft.com/office/infopath/2007/PartnerControls">
-  <documentManagement>
-    <_activity xmlns="b16a9495-4dfd-42d3-807b-98cb11f03b43" xsi:nil="true"/>
-  </documentManagement>
-</p:properties>
+<file path=customXml/itemProps3.xml><?xml version="1.0" encoding="utf-8"?>
+<ds:datastoreItem xmlns:ds="http://schemas.openxmlformats.org/officeDocument/2006/customXml" ds:itemID="{11111111-1234-1234-1234-123412341234}">
+  <ds:schemaRefs>
+    <ds:schemaRef ds:uri="http://customooxmlschemas.google.com/"/>
+    <ds:schemaRef ds:uri="http://schemas.openxmlformats.org/officeDocument/2006/relationships"/>
+  </ds:schemaRefs>
+</ds:datastoreItem>
 </file>
 
-<file path=customXml/item5.xml><?xml version="1.0" encoding="utf-8"?>
-<?mso-contentType ?>
-<FormTemplates xmlns="http://schemas.microsoft.com/sharepoint/v3/contenttype/forms">
-  <Display>DocumentLibraryForm</Display>
-  <Edit>DocumentLibraryForm</Edit>
-  <New>DocumentLibraryForm</New>
-</FormTemplates>
+<file path=customXml/itemProps4.xml><?xml version="1.0" encoding="utf-8"?>
+<ds:datastoreItem xmlns:ds="http://schemas.openxmlformats.org/officeDocument/2006/customXml" ds:itemID="{8C593334-F82D-4C95-8B9D-FA35DB2BF261}">
+  <ds:schemaRefs>
+    <ds:schemaRef ds:uri="http://schemas.openxmlformats.org/officeDocument/2006/bibliography"/>
+  </ds:schemaRefs>
+</ds:datastoreItem>
 </file>
 
-<file path=customXml/itemProps1.xml><?xml version="1.0" encoding="utf-8"?>
+<file path=customXml/itemProps5.xml><?xml version="1.0" encoding="utf-8"?>
 <ds:datastoreItem xmlns:ds="http://schemas.openxmlformats.org/officeDocument/2006/customXml" ds:itemID="{1CD39011-2B34-4226-8638-59B13D86301D}">
   <ds:schemaRefs>
     <ds:schemaRef ds:uri="http://schemas.microsoft.com/office/2006/metadata/contentType"/>
@@ -9310,39 +9713,4 @@
     <ds:schemaRef ds:uri="http://schemas.microsoft.com/internal/obd"/>
   </ds:schemaRefs>
 </ds:datastoreItem>
-</file>
-
-<file path=customXml/itemProps2.xml><?xml version="1.0" encoding="utf-8"?>
-<ds:datastoreItem xmlns:ds="http://schemas.openxmlformats.org/officeDocument/2006/customXml" ds:itemID="{8C593334-F82D-4C95-8B9D-FA35DB2BF261}">
-  <ds:schemaRefs>
-    <ds:schemaRef ds:uri="http://schemas.openxmlformats.org/officeDocument/2006/bibliography"/>
-  </ds:schemaRefs>
-</ds:datastoreItem>
-</file>
-
-<file path=customXml/itemProps3.xml><?xml version="1.0" encoding="utf-8"?>
-<ds:datastoreItem xmlns:ds="http://schemas.openxmlformats.org/officeDocument/2006/customXml" ds:itemID="{11111111-1234-1234-1234-123412341234}">
-  <ds:schemaRefs>
-    <ds:schemaRef ds:uri="http://customooxmlschemas.google.com/"/>
-    <ds:schemaRef ds:uri="http://schemas.openxmlformats.org/officeDocument/2006/relationships"/>
-  </ds:schemaRefs>
-</ds:datastoreItem>
-</file>
-
-<file path=customXml/itemProps4.xml><?xml version="1.0" encoding="utf-8"?>
-<ds:datastoreItem xmlns:ds="http://schemas.openxmlformats.org/officeDocument/2006/customXml" ds:itemID="{D51EB97A-8C7A-4EE1-A3AD-E57FDBFA6BEE}">
-  <ds:schemaRefs>
-    <ds:schemaRef ds:uri="http://schemas.microsoft.com/office/2006/metadata/properties"/>
-    <ds:schemaRef ds:uri="http://schemas.microsoft.com/office/infopath/2007/PartnerControls"/>
-    <ds:schemaRef ds:uri="b16a9495-4dfd-42d3-807b-98cb11f03b43"/>
-  </ds:schemaRefs>
-</ds:datastoreItem>
-</file>
-
-<file path=customXml/itemProps5.xml><?xml version="1.0" encoding="utf-8"?>
-<ds:datastoreItem xmlns:ds="http://schemas.openxmlformats.org/officeDocument/2006/customXml" ds:itemID="{AD64260C-1345-4C21-A804-B9FBE7B91489}">
-  <ds:schemaRefs>
-    <ds:schemaRef ds:uri="http://schemas.microsoft.com/sharepoint/v3/contenttype/forms"/>
-  </ds:schemaRefs>
-</ds:datastoreItem>
 </file>
</xml_diff>

<commit_message>
31.10 - working on binomial and poisson.
</commit_message>
<xml_diff>
--- a/CA1-Stats for Data Analytics _with_AI_declaration.docx
+++ b/CA1-Stats for Data Analytics _with_AI_declaration.docx
@@ -5205,15 +5205,7 @@
         <w:t xml:space="preserve">available at UCI repository named </w:t>
       </w:r>
       <w:r>
-        <w:t xml:space="preserve">“Estimation of Obesity Levels Based </w:t>
-      </w:r>
-      <w:proofErr w:type="gramStart"/>
-      <w:r>
-        <w:t>On</w:t>
-      </w:r>
-      <w:proofErr w:type="gramEnd"/>
-      <w:r>
-        <w:t xml:space="preserve"> Eating Habits and Physical Condition”</w:t>
+        <w:t>“Estimation of Obesity Levels Based On Eating Habits and Physical Condition”</w:t>
       </w:r>
       <w:r>
         <w:t xml:space="preserve">. It contains 16 features, including categorical and numerical values. It contains 2111 instances but not all off them will be used in this assignment. </w:t>
@@ -5380,12 +5372,10 @@
         <w:t xml:space="preserve"> = </w:t>
       </w:r>
       <w:proofErr w:type="spellStart"/>
-      <w:proofErr w:type="gramStart"/>
       <w:r>
         <w:t>df.iloc</w:t>
       </w:r>
       <w:proofErr w:type="spellEnd"/>
-      <w:proofErr w:type="gramEnd"/>
       <w:r>
         <w:t>[:498].copy()</w:t>
       </w:r>
@@ -5423,15 +5413,7 @@
       </w:r>
       <w:proofErr w:type="spellEnd"/>
       <w:r>
-        <w:t>(</w:t>
-      </w:r>
-      <w:proofErr w:type="gramStart"/>
-      <w:r>
-        <w:t>).sum</w:t>
-      </w:r>
-      <w:proofErr w:type="gramEnd"/>
-      <w:r>
-        <w:t xml:space="preserve">() to confirm this. Secondly, for the categorical features, the program understands categorical features as numerical ones. The explanation is because the possible answers in the survey, for example: </w:t>
+        <w:t xml:space="preserve">().sum() to confirm this. Secondly, for the categorical features, the program understands categorical features as numerical ones. The explanation is because the possible answers in the survey, for example: </w:t>
       </w:r>
     </w:p>
     <w:p>
@@ -5543,16 +5525,7 @@
         <w:ind w:firstLine="720"/>
       </w:pPr>
       <w:r>
-        <w:t xml:space="preserve">After that it was plotted a graph showing the 498 data. Just seeing the </w:t>
-      </w:r>
-      <w:r>
-        <w:t>graph,</w:t>
-      </w:r>
-      <w:r>
-        <w:t xml:space="preserve"> it</w:t>
-      </w:r>
-      <w:r>
-        <w:t xml:space="preserve"> looks like a bell shape but skewed to the left. Another perception is that the data goes up to 160kg, probably containing outliers.</w:t>
+        <w:t>After that it was plotted a graph showing the 498 data. Just seeing the graph, it looks like a bell shape but skewed to the left. Another perception is that the data goes up to 160kg, probably containing outliers.</w:t>
       </w:r>
     </w:p>
     <w:p>
@@ -5565,6 +5538,9 @@
         <w:ind w:firstLine="720"/>
       </w:pPr>
       <w:r>
+        <w:rPr>
+          <w:noProof/>
+        </w:rPr>
         <w:drawing>
           <wp:inline distT="0" distB="0" distL="0" distR="0" wp14:anchorId="69A28B2D" wp14:editId="30418174">
             <wp:extent cx="5731510" cy="4394200"/>
@@ -5664,6 +5640,9 @@
         <w:ind w:firstLine="720"/>
       </w:pPr>
       <w:r>
+        <w:rPr>
+          <w:noProof/>
+        </w:rPr>
         <w:lastRenderedPageBreak/>
         <w:drawing>
           <wp:inline distT="0" distB="0" distL="0" distR="0" wp14:anchorId="17536CC0" wp14:editId="72D71E14">
@@ -5750,19 +5729,14 @@
     <w:p>
       <w:r>
         <w:tab/>
-        <w:t xml:space="preserve">Bellow a graph showing the data for Weight, but in the </w:t>
-      </w:r>
-      <w:proofErr w:type="gramStart"/>
-      <w:r>
-        <w:t>y</w:t>
-      </w:r>
-      <w:proofErr w:type="gramEnd"/>
-      <w:r>
-        <w:t xml:space="preserve"> axis was plotted the density of the data instead of the total number.</w:t>
-      </w:r>
-    </w:p>
-    <w:p>
-      <w:r>
+        <w:t>Bellow a graph showing the data for Weight, but in the y axis was plotted the density of the data instead of the total number.</w:t>
+      </w:r>
+    </w:p>
+    <w:p>
+      <w:r>
+        <w:rPr>
+          <w:noProof/>
+        </w:rPr>
         <w:lastRenderedPageBreak/>
         <w:drawing>
           <wp:inline distT="0" distB="0" distL="0" distR="0" wp14:anchorId="2CDF56C1" wp14:editId="2DB9B72E">
@@ -5816,45 +5790,174 @@
         <w:t>Binomial and Poison Distribution</w:t>
       </w:r>
     </w:p>
-    <w:p/>
-    <w:p>
-      <w:pPr>
-        <w:pStyle w:val="Ttulo1"/>
-        <w:spacing w:before="0"/>
-        <w:jc w:val="both"/>
-      </w:pPr>
-      <w:r>
-        <w:t>Normal Distribution</w:t>
-      </w:r>
-    </w:p>
     <w:p>
       <w:r>
         <w:tab/>
-        <w:t xml:space="preserve">The feature </w:t>
-      </w:r>
-      <w:r>
-        <w:t>that I will analyse is the Height. Usually, this feature behaves like a normal distribution in real live. The objective is to check if for the 498 amount of data it is the same behaviour.</w:t>
-      </w:r>
-    </w:p>
-    <w:p>
-      <w:pPr>
-        <w:ind w:firstLine="720"/>
-      </w:pPr>
-      <w:r>
-        <w:t>First, I plotted a graph to check the shape. The result was similar with a bell shape as bellow.</w:t>
-      </w:r>
-    </w:p>
-    <w:p>
-      <w:pPr>
-        <w:ind w:firstLine="720"/>
-      </w:pPr>
+        <w:t>For this task I transformed the target value “</w:t>
+      </w:r>
+      <w:proofErr w:type="spellStart"/>
+      <w:r>
+        <w:t>NObeyesdad_Binomial</w:t>
+      </w:r>
+      <w:proofErr w:type="spellEnd"/>
+      <w:r>
+        <w:t xml:space="preserve">” in two possible outcomes. The original dataset had 7 possibles outcomes: </w:t>
+      </w:r>
+      <w:r>
+        <w:t>'</w:t>
+      </w:r>
+      <w:proofErr w:type="spellStart"/>
+      <w:r>
+        <w:t>Normal_Weight</w:t>
+      </w:r>
+      <w:proofErr w:type="spellEnd"/>
+      <w:r>
+        <w:t>', '</w:t>
+      </w:r>
+      <w:proofErr w:type="spellStart"/>
+      <w:r>
+        <w:t>Overweight_Level_I</w:t>
+      </w:r>
+      <w:proofErr w:type="spellEnd"/>
+      <w:r>
+        <w:t>',</w:t>
+      </w:r>
+      <w:r>
+        <w:t xml:space="preserve"> </w:t>
+      </w:r>
+      <w:r>
+        <w:t>'</w:t>
+      </w:r>
+      <w:proofErr w:type="spellStart"/>
+      <w:r>
+        <w:t>Overweight_Level_II</w:t>
+      </w:r>
+      <w:proofErr w:type="spellEnd"/>
+      <w:r>
+        <w:t>',</w:t>
+      </w:r>
+      <w:r>
+        <w:t xml:space="preserve"> </w:t>
+      </w:r>
+      <w:r>
+        <w:t>'</w:t>
+      </w:r>
+      <w:proofErr w:type="spellStart"/>
+      <w:r>
+        <w:t>Obesity_Type_I</w:t>
+      </w:r>
+      <w:proofErr w:type="spellEnd"/>
+      <w:r>
+        <w:t>', '</w:t>
+      </w:r>
+      <w:proofErr w:type="spellStart"/>
+      <w:r>
+        <w:t>Insufficient_Weight</w:t>
+      </w:r>
+      <w:proofErr w:type="spellEnd"/>
+      <w:r>
+        <w:t>', '</w:t>
+      </w:r>
+      <w:proofErr w:type="spellStart"/>
+      <w:r>
+        <w:t>Obesity_Type_II</w:t>
+      </w:r>
+      <w:proofErr w:type="spellEnd"/>
+      <w:r>
+        <w:t>'</w:t>
+      </w:r>
+      <w:r>
+        <w:t xml:space="preserve"> and </w:t>
+      </w:r>
+      <w:r>
+        <w:t>'</w:t>
+      </w:r>
+      <w:proofErr w:type="spellStart"/>
+      <w:r>
+        <w:t>Obesity_Type_III</w:t>
+      </w:r>
+      <w:proofErr w:type="spellEnd"/>
+      <w:r>
+        <w:t>'</w:t>
+      </w:r>
+      <w:r>
+        <w:t xml:space="preserve">. Using the </w:t>
+      </w:r>
+      <w:proofErr w:type="spellStart"/>
+      <w:r>
+        <w:t>numpy</w:t>
+      </w:r>
+      <w:proofErr w:type="spellEnd"/>
+      <w:r>
+        <w:t xml:space="preserve"> function where, all the data that was </w:t>
+      </w:r>
+      <w:proofErr w:type="spellStart"/>
+      <w:r>
+        <w:t>Normal_Weight</w:t>
+      </w:r>
+      <w:proofErr w:type="spellEnd"/>
+      <w:r>
+        <w:t xml:space="preserve"> became “1” and the rest “0”. Using the formula unique I could check if the previous function worked and using </w:t>
+      </w:r>
+      <w:proofErr w:type="spellStart"/>
+      <w:r>
+        <w:t>value_counts</w:t>
+      </w:r>
+      <w:proofErr w:type="spellEnd"/>
+      <w:r>
+        <w:t xml:space="preserve"> formula I could check how many data I have for </w:t>
+      </w:r>
+      <w:proofErr w:type="spellStart"/>
+      <w:r>
+        <w:t>Normal_weight</w:t>
+      </w:r>
+      <w:proofErr w:type="spellEnd"/>
+      <w:r>
+        <w:t xml:space="preserve"> = 287 and </w:t>
+      </w:r>
+      <w:proofErr w:type="spellStart"/>
+      <w:r>
+        <w:t>Not_Normal_weight</w:t>
+      </w:r>
+      <w:proofErr w:type="spellEnd"/>
+      <w:r>
+        <w:t xml:space="preserve"> = 211.</w:t>
+      </w:r>
+    </w:p>
+    <w:p>
+      <w:r>
+        <w:tab/>
+        <w:t>Later, it was time to calculate the Probability Mass Function (PMF) of e</w:t>
+      </w:r>
+      <w:r>
+        <w:t xml:space="preserve">xactly 4 </w:t>
+      </w:r>
+      <w:r>
+        <w:t xml:space="preserve">people with </w:t>
+      </w:r>
+      <w:proofErr w:type="spellStart"/>
+      <w:r>
+        <w:t>Normal_Weight</w:t>
+      </w:r>
+      <w:proofErr w:type="spellEnd"/>
+      <w:r>
+        <w:t xml:space="preserve"> among 10</w:t>
+      </w:r>
+      <w:r>
+        <w:t>. The result</w:t>
+      </w:r>
+      <w:r>
+        <w:t xml:space="preserve"> for exactly 4 people having Normal Weight among 10 is 13,40%. The rest of the results we can see in the graphic below:</w:t>
+      </w:r>
+    </w:p>
+    <w:p>
       <w:r>
         <w:lastRenderedPageBreak/>
         <w:drawing>
-          <wp:inline distT="0" distB="0" distL="0" distR="0" wp14:anchorId="72E71AB1" wp14:editId="458B4A83">
-            <wp:extent cx="4007861" cy="3032760"/>
-            <wp:effectExtent l="0" t="0" r="0" b="0"/>
-            <wp:docPr id="6" name="Imagem 6"/>
+          <wp:inline distT="0" distB="0" distL="0" distR="0" wp14:anchorId="459EB8D2" wp14:editId="7F93A8D1">
+            <wp:extent cx="5326380" cy="4171525"/>
+            <wp:effectExtent l="0" t="0" r="7620" b="635"/>
+            <wp:docPr id="8" name="Imagem 8"/>
             <wp:cNvGraphicFramePr>
               <a:graphicFrameLocks xmlns:a="http://schemas.openxmlformats.org/drawingml/2006/main" noChangeAspect="1"/>
             </wp:cNvGraphicFramePr>
@@ -5874,7 +5977,7 @@
                   <pic:spPr>
                     <a:xfrm>
                       <a:off x="0" y="0"/>
-                      <a:ext cx="4010509" cy="3034764"/>
+                      <a:ext cx="5346235" cy="4187075"/>
                     </a:xfrm>
                     <a:prstGeom prst="rect">
                       <a:avLst/>
@@ -5888,143 +5991,18 @@
       </w:r>
     </w:p>
     <w:p>
-      <w:pPr>
-        <w:ind w:firstLine="720"/>
-      </w:pPr>
-      <w:r>
-        <w:t xml:space="preserve">Then, with the mean and standard deviation (std) I used the </w:t>
-      </w:r>
-      <w:r>
-        <w:t>68-95-99.7 empirical rule</w:t>
-      </w:r>
-      <w:r>
-        <w:t>, which states that 68% of the data is within the first std, 95% with the 2</w:t>
-      </w:r>
-      <w:proofErr w:type="gramStart"/>
-      <w:r>
-        <w:rPr>
-          <w:vertAlign w:val="superscript"/>
-        </w:rPr>
-        <w:t>nd</w:t>
-      </w:r>
-      <w:r>
-        <w:rPr>
-          <w:vertAlign w:val="superscript"/>
-        </w:rPr>
-        <w:t xml:space="preserve"> </w:t>
-      </w:r>
-      <w:r>
-        <w:t xml:space="preserve"> std</w:t>
-      </w:r>
-      <w:proofErr w:type="gramEnd"/>
-      <w:r>
-        <w:t xml:space="preserve"> and 99,7% within the 3</w:t>
-      </w:r>
-      <w:r>
-        <w:rPr>
-          <w:vertAlign w:val="superscript"/>
-        </w:rPr>
-        <w:t>rd</w:t>
-      </w:r>
-      <w:r>
-        <w:t xml:space="preserve"> std. The result shows that 67,27% of the data is within the 1</w:t>
-      </w:r>
-      <w:r>
-        <w:rPr>
-          <w:vertAlign w:val="superscript"/>
-        </w:rPr>
-        <w:t>st</w:t>
-      </w:r>
-      <w:r>
-        <w:t xml:space="preserve"> std, 97,39% are within the 2</w:t>
-      </w:r>
-      <w:r>
-        <w:rPr>
-          <w:vertAlign w:val="superscript"/>
-        </w:rPr>
-        <w:t>nd</w:t>
-      </w:r>
-      <w:r>
-        <w:t xml:space="preserve"> std and 99,8% are within the 3</w:t>
-      </w:r>
-      <w:r>
-        <w:rPr>
-          <w:vertAlign w:val="superscript"/>
-        </w:rPr>
-        <w:t>rd</w:t>
-      </w:r>
-      <w:r>
-        <w:t xml:space="preserve"> std.</w:t>
-      </w:r>
-      <w:r>
-        <w:t xml:space="preserve"> It is clear that this data is a normal distribution</w:t>
-      </w:r>
-    </w:p>
-    <w:p>
-      <w:pPr>
-        <w:ind w:firstLine="720"/>
-      </w:pPr>
-      <w:r>
-        <w:t xml:space="preserve">With the function z-score </w:t>
-      </w:r>
-      <w:r>
-        <w:t xml:space="preserve">it is possible to check for all the data how far the current value is from the mean. For example, the first value is </w:t>
-      </w:r>
-      <w:r>
-        <w:t>-0.680491</w:t>
-      </w:r>
-      <w:r>
-        <w:t xml:space="preserve"> far from the mean (</w:t>
-      </w:r>
-      <w:r>
-        <w:t>1.68</w:t>
-      </w:r>
-      <w:r>
-        <w:t>cm), which means that the value is bellow the mean but within the 1</w:t>
-      </w:r>
-      <w:r>
-        <w:rPr>
-          <w:vertAlign w:val="superscript"/>
-        </w:rPr>
-        <w:t>st</w:t>
-      </w:r>
-      <w:r>
-        <w:t xml:space="preserve"> std. </w:t>
-      </w:r>
-    </w:p>
-    <w:p>
-      <w:pPr>
-        <w:ind w:firstLine="720"/>
-      </w:pPr>
-      <w:r>
-        <w:t>I plotted the function head to double check the first value of the data. The number is 1,62 which means the z-score is correct.</w:t>
-      </w:r>
-    </w:p>
-    <w:p>
-      <w:pPr>
-        <w:ind w:firstLine="720"/>
-      </w:pPr>
-      <w:r>
-        <w:t xml:space="preserve">Also, I plotted the Q-Q plot. It </w:t>
-      </w:r>
-      <w:r>
-        <w:t>compares observed quantiles with quantiles expected under a normal distribution. If the data are approximately normal, most points should lie reasonably close to the reference line.</w:t>
-      </w:r>
-      <w:r>
-        <w:t xml:space="preserve"> The results are showed below.</w:t>
-      </w:r>
-    </w:p>
-    <w:p>
-      <w:pPr>
-        <w:ind w:firstLine="720"/>
-      </w:pPr>
-      <w:r>
-        <w:lastRenderedPageBreak/>
+      <w:r>
+        <w:tab/>
+        <w:t>Using the formula of Cumulative Mass Function (CDF) it is possible to check the cumulative percentage of probability for Normal Weight among 10 people. The chart below shows exactly this. Using “4” as an example, it shows the sum of “0”, “1”, “2”, “3” and “4”.</w:t>
+      </w:r>
+    </w:p>
+    <w:p>
+      <w:r>
         <w:drawing>
-          <wp:inline distT="0" distB="0" distL="0" distR="0" wp14:anchorId="40821CC9" wp14:editId="208BA550">
-            <wp:extent cx="4377063" cy="3322320"/>
-            <wp:effectExtent l="0" t="0" r="4445" b="0"/>
-            <wp:docPr id="7" name="Imagem 7"/>
+          <wp:inline distT="0" distB="0" distL="0" distR="0" wp14:anchorId="08596BC9" wp14:editId="1EBD5336">
+            <wp:extent cx="5097780" cy="3820229"/>
+            <wp:effectExtent l="0" t="0" r="7620" b="8890"/>
+            <wp:docPr id="9" name="Imagem 9"/>
             <wp:cNvGraphicFramePr>
               <a:graphicFrameLocks xmlns:a="http://schemas.openxmlformats.org/drawingml/2006/main" noChangeAspect="1"/>
             </wp:cNvGraphicFramePr>
@@ -6044,6 +6022,249 @@
                   <pic:spPr>
                     <a:xfrm>
                       <a:off x="0" y="0"/>
+                      <a:ext cx="5100290" cy="3822110"/>
+                    </a:xfrm>
+                    <a:prstGeom prst="rect">
+                      <a:avLst/>
+                    </a:prstGeom>
+                  </pic:spPr>
+                </pic:pic>
+              </a:graphicData>
+            </a:graphic>
+          </wp:inline>
+        </w:drawing>
+      </w:r>
+    </w:p>
+    <w:p>
+      <w:r>
+        <w:lastRenderedPageBreak/>
+        <w:tab/>
+        <w:t xml:space="preserve">Using the binomial function we can check the probability </w:t>
+      </w:r>
+    </w:p>
+    <w:p/>
+    <w:p/>
+    <w:p>
+      <w:pPr>
+        <w:pStyle w:val="Ttulo1"/>
+        <w:spacing w:before="0"/>
+        <w:jc w:val="both"/>
+      </w:pPr>
+      <w:r>
+        <w:t>Normal Distribution</w:t>
+      </w:r>
+    </w:p>
+    <w:p>
+      <w:r>
+        <w:tab/>
+        <w:t xml:space="preserve">The feature </w:t>
+      </w:r>
+      <w:r>
+        <w:t>that I will analyse is the Height. Usually, this feature behaves like a normal distribution in real live. The objective is to check if for the 498 amount of data it is the same behaviour.</w:t>
+      </w:r>
+    </w:p>
+    <w:p>
+      <w:pPr>
+        <w:ind w:firstLine="720"/>
+      </w:pPr>
+      <w:r>
+        <w:t>First, I plotted a graph to check the shape. The result was similar with a bell shape as bellow.</w:t>
+      </w:r>
+    </w:p>
+    <w:p>
+      <w:pPr>
+        <w:ind w:firstLine="720"/>
+      </w:pPr>
+      <w:r>
+        <w:rPr>
+          <w:noProof/>
+        </w:rPr>
+        <w:drawing>
+          <wp:inline distT="0" distB="0" distL="0" distR="0" wp14:anchorId="72E71AB1" wp14:editId="458B4A83">
+            <wp:extent cx="4007861" cy="3032760"/>
+            <wp:effectExtent l="0" t="0" r="0" b="0"/>
+            <wp:docPr id="6" name="Imagem 6"/>
+            <wp:cNvGraphicFramePr>
+              <a:graphicFrameLocks xmlns:a="http://schemas.openxmlformats.org/drawingml/2006/main" noChangeAspect="1"/>
+            </wp:cNvGraphicFramePr>
+            <a:graphic xmlns:a="http://schemas.openxmlformats.org/drawingml/2006/main">
+              <a:graphicData uri="http://schemas.openxmlformats.org/drawingml/2006/picture">
+                <pic:pic xmlns:pic="http://schemas.openxmlformats.org/drawingml/2006/picture">
+                  <pic:nvPicPr>
+                    <pic:cNvPr id="1" name=""/>
+                    <pic:cNvPicPr/>
+                  </pic:nvPicPr>
+                  <pic:blipFill>
+                    <a:blip r:embed="rId21"/>
+                    <a:stretch>
+                      <a:fillRect/>
+                    </a:stretch>
+                  </pic:blipFill>
+                  <pic:spPr>
+                    <a:xfrm>
+                      <a:off x="0" y="0"/>
+                      <a:ext cx="4010509" cy="3034764"/>
+                    </a:xfrm>
+                    <a:prstGeom prst="rect">
+                      <a:avLst/>
+                    </a:prstGeom>
+                  </pic:spPr>
+                </pic:pic>
+              </a:graphicData>
+            </a:graphic>
+          </wp:inline>
+        </w:drawing>
+      </w:r>
+    </w:p>
+    <w:p>
+      <w:pPr>
+        <w:ind w:firstLine="720"/>
+      </w:pPr>
+      <w:r>
+        <w:t xml:space="preserve">Then, with the mean and standard deviation (std) I used the </w:t>
+      </w:r>
+      <w:r>
+        <w:t>68-95-99.7 empirical rule</w:t>
+      </w:r>
+      <w:r>
+        <w:t>, which states that 68% of the data is within the first std, 95% with the 2</w:t>
+      </w:r>
+      <w:r>
+        <w:rPr>
+          <w:vertAlign w:val="superscript"/>
+        </w:rPr>
+        <w:t>nd</w:t>
+      </w:r>
+      <w:r>
+        <w:rPr>
+          <w:vertAlign w:val="superscript"/>
+        </w:rPr>
+        <w:t xml:space="preserve"> </w:t>
+      </w:r>
+      <w:r>
+        <w:t xml:space="preserve"> std and 99,7% within the 3</w:t>
+      </w:r>
+      <w:r>
+        <w:rPr>
+          <w:vertAlign w:val="superscript"/>
+        </w:rPr>
+        <w:t>rd</w:t>
+      </w:r>
+      <w:r>
+        <w:t xml:space="preserve"> std. The result shows that 67,27% of the data is within the 1</w:t>
+      </w:r>
+      <w:r>
+        <w:rPr>
+          <w:vertAlign w:val="superscript"/>
+        </w:rPr>
+        <w:t>st</w:t>
+      </w:r>
+      <w:r>
+        <w:t xml:space="preserve"> std, 97,39% are within the 2</w:t>
+      </w:r>
+      <w:r>
+        <w:rPr>
+          <w:vertAlign w:val="superscript"/>
+        </w:rPr>
+        <w:t>nd</w:t>
+      </w:r>
+      <w:r>
+        <w:t xml:space="preserve"> std and 99,8% are within the 3</w:t>
+      </w:r>
+      <w:r>
+        <w:rPr>
+          <w:vertAlign w:val="superscript"/>
+        </w:rPr>
+        <w:t>rd</w:t>
+      </w:r>
+      <w:r>
+        <w:t xml:space="preserve"> std.</w:t>
+      </w:r>
+      <w:r>
+        <w:t xml:space="preserve"> It is clear that this data is a normal distribution</w:t>
+      </w:r>
+    </w:p>
+    <w:p>
+      <w:pPr>
+        <w:ind w:firstLine="720"/>
+      </w:pPr>
+      <w:r>
+        <w:t xml:space="preserve">With the function z-score </w:t>
+      </w:r>
+      <w:r>
+        <w:t xml:space="preserve">it is possible to check for all the data how far the current value is from the mean. For example, the first value is </w:t>
+      </w:r>
+      <w:r>
+        <w:t>-0.680491</w:t>
+      </w:r>
+      <w:r>
+        <w:t xml:space="preserve"> far from the mean (</w:t>
+      </w:r>
+      <w:r>
+        <w:t>1.68</w:t>
+      </w:r>
+      <w:r>
+        <w:t>cm), which means that the value is bellow the mean but within the 1</w:t>
+      </w:r>
+      <w:r>
+        <w:rPr>
+          <w:vertAlign w:val="superscript"/>
+        </w:rPr>
+        <w:t>st</w:t>
+      </w:r>
+      <w:r>
+        <w:t xml:space="preserve"> std. </w:t>
+      </w:r>
+    </w:p>
+    <w:p>
+      <w:pPr>
+        <w:ind w:firstLine="720"/>
+      </w:pPr>
+      <w:r>
+        <w:t>I plotted the function head to double check the first value of the data. The number is 1,62 which means the z-score is correct.</w:t>
+      </w:r>
+    </w:p>
+    <w:p>
+      <w:pPr>
+        <w:ind w:firstLine="720"/>
+      </w:pPr>
+      <w:r>
+        <w:t>Also, I plotted the Q-Q plot. It compares observed quantiles with quantiles expected under a normal distribution. If the data are approximately normal, most points should lie reasonably close to the reference line. The results are showed below.</w:t>
+      </w:r>
+    </w:p>
+    <w:p>
+      <w:pPr>
+        <w:ind w:firstLine="720"/>
+      </w:pPr>
+      <w:r>
+        <w:rPr>
+          <w:noProof/>
+        </w:rPr>
+        <w:lastRenderedPageBreak/>
+        <w:drawing>
+          <wp:inline distT="0" distB="0" distL="0" distR="0" wp14:anchorId="40821CC9" wp14:editId="208BA550">
+            <wp:extent cx="4377063" cy="3322320"/>
+            <wp:effectExtent l="0" t="0" r="4445" b="0"/>
+            <wp:docPr id="7" name="Imagem 7"/>
+            <wp:cNvGraphicFramePr>
+              <a:graphicFrameLocks xmlns:a="http://schemas.openxmlformats.org/drawingml/2006/main" noChangeAspect="1"/>
+            </wp:cNvGraphicFramePr>
+            <a:graphic xmlns:a="http://schemas.openxmlformats.org/drawingml/2006/main">
+              <a:graphicData uri="http://schemas.openxmlformats.org/drawingml/2006/picture">
+                <pic:pic xmlns:pic="http://schemas.openxmlformats.org/drawingml/2006/picture">
+                  <pic:nvPicPr>
+                    <pic:cNvPr id="1" name=""/>
+                    <pic:cNvPicPr/>
+                  </pic:nvPicPr>
+                  <pic:blipFill>
+                    <a:blip r:embed="rId22"/>
+                    <a:stretch>
+                      <a:fillRect/>
+                    </a:stretch>
+                  </pic:blipFill>
+                  <pic:spPr>
+                    <a:xfrm>
+                      <a:off x="0" y="0"/>
                       <a:ext cx="4380930" cy="3325255"/>
                     </a:xfrm>
                     <a:prstGeom prst="rect">
@@ -6324,7 +6545,7 @@
                       <pic:cNvPicPr preferRelativeResize="0"/>
                     </pic:nvPicPr>
                     <pic:blipFill>
-                      <a:blip r:embed="rId21"/>
+                      <a:blip r:embed="rId23"/>
                       <a:srcRect/>
                       <a:stretch>
                         <a:fillRect/>
@@ -6917,7 +7138,7 @@
     </w:p>
     <w:p/>
     <w:sectPr>
-      <w:footerReference w:type="default" r:id="rId22"/>
+      <w:footerReference w:type="default" r:id="rId24"/>
       <w:pgSz w:w="11906" w:h="16838"/>
       <w:pgMar w:top="1440" w:right="1440" w:bottom="1440" w:left="1440" w:header="708" w:footer="708" w:gutter="0"/>
       <w:pgNumType w:start="1"/>
@@ -9379,140 +9600,6 @@
 </file>
 
 <file path=customXml/item1.xml><?xml version="1.0" encoding="utf-8"?>
-<?mso-contentType ?>
-<FormTemplates xmlns="http://schemas.microsoft.com/sharepoint/v3/contenttype/forms">
-  <Display>DocumentLibraryForm</Display>
-  <Edit>DocumentLibraryForm</Edit>
-  <New>DocumentLibraryForm</New>
-</FormTemplates>
-</file>
-
-<file path=customXml/item2.xml><?xml version="1.0" encoding="utf-8"?>
-<p:properties xmlns:p="http://schemas.microsoft.com/office/2006/metadata/properties" xmlns:xsi="http://www.w3.org/2001/XMLSchema-instance" xmlns:pc="http://schemas.microsoft.com/office/infopath/2007/PartnerControls">
-  <documentManagement>
-    <_activity xmlns="b16a9495-4dfd-42d3-807b-98cb11f03b43" xsi:nil="true"/>
-  </documentManagement>
-</p:properties>
-</file>
-
-<file path=customXml/item3.xml><?xml version="1.0" encoding="utf-8"?>
-<go:gDocsCustomXmlDataStorage xmlns:go="http://customooxmlschemas.google.com/" xmlns:r="http://schemas.openxmlformats.org/officeDocument/2006/relationships" uri="GoogleDocsCustomDataVersion2">
-  <go:docsCustomData xmlns:go="http://customooxmlschemas.google.com/" roundtripDataSignature="AMtx7miehlgh2pzFvkmpnhkVaeODs3Wnuw==">CgMxLjAyCGguZ2pkZ3hzMgloLjMwajB6bGwyCWguMWZvYjl0ZTIJaC4zem55c2g3MgloLjJldDkycDAyDmgua2ZranMzcndsMmMxOAByITF6bEVRVXYyWkdtTjZWemdfYk5uaGpmb0x1c2hhYUo3dw==</go:docsCustomData>
-</go:gDocsCustomXmlDataStorage>
-</file>
-
-<file path=customXml/item4.xml><?xml version="1.0" encoding="utf-8"?>
-<b:Sources xmlns:b="http://schemas.openxmlformats.org/officeDocument/2006/bibliography" xmlns="http://schemas.openxmlformats.org/officeDocument/2006/bibliography" SelectedStyle="\HarvardAnglia2008OfficeOnline.xsl" StyleName="Harvard - Anglia" Version="2008">
-  <b:Source>
-    <b:Tag>Pat18</b:Tag>
-    <b:SourceType>ArticleInAPeriodical</b:SourceType>
-    <b:Guid>{5B52B951-322D-4CCD-8748-31433AF64BBC}</b:Guid>
-    <b:Title>Data Analytics Systems and SME type - a Design Science Approach</b:Title>
-    <b:Year>2018</b:Year>
-    <b:LCID>en-IE</b:LCID>
-    <b:Author>
-      <b:Author>
-        <b:NameList>
-          <b:Person>
-            <b:Last>Patrick ULRICH</b:Last>
-            <b:First>Wolfgang</b:First>
-            <b:Middle>BECKER, Alexandra FIBITZ, Eva REITELSHÖFER</b:Middle>
-          </b:Person>
-        </b:NameList>
-      </b:Author>
-    </b:Author>
-    <b:PeriodicalTitle>ScienceDirect</b:PeriodicalTitle>
-    <b:Pages>1162–1170</b:Pages>
-    <b:RefOrder>1</b:RefOrder>
-  </b:Source>
-  <b:Source>
-    <b:Tag>Gün19</b:Tag>
-    <b:SourceType>ArticleInAPeriodical</b:SourceType>
-    <b:Guid>{8B29ADD7-CF57-41D6-8460-C908A42EA451}</b:Guid>
-    <b:Author>
-      <b:Author>
-        <b:NameList>
-          <b:Person>
-            <b:Last>Günther</b:Last>
-            <b:First>Lisa</b:First>
-            <b:Middle>C., Colangelo, Eduardo, Wiendahl, Hans-Hermann, Bauer, Christian</b:Middle>
-          </b:Person>
-        </b:NameList>
-      </b:Author>
-    </b:Author>
-    <b:Title>Data quality assessment for improved decision-making: a methodology for small and medium-sized enterprises</b:Title>
-    <b:PeriodicalTitle>Procedia Manufacturing</b:PeriodicalTitle>
-    <b:Year>2019</b:Year>
-    <b:Pages>583–591</b:Pages>
-    <b:RefOrder>2</b:RefOrder>
-  </b:Source>
-  <b:Source>
-    <b:Tag>Ber21</b:Tag>
-    <b:SourceType>ArticleInAPeriodical</b:SourceType>
-    <b:Guid>{1F06AFAC-C1ED-469E-AF8B-13855CC9A64D}</b:Guid>
-    <b:Author>
-      <b:Author>
-        <b:NameList>
-          <b:Person>
-            <b:Last>Bernritter</b:Last>
-            <b:First>S.F.,</b:First>
-            <b:Middle>Ketelaar, P.E. and Sotgiu, F.</b:Middle>
-          </b:Person>
-        </b:NameList>
-      </b:Author>
-    </b:Author>
-    <b:Title>Behaviorally targeted location-based mobile marketing’</b:Title>
-    <b:PeriodicalTitle>Journal of the Academy of Marketing Science</b:PeriodicalTitle>
-    <b:Year>2021</b:Year>
-    <b:Pages>49:677–702</b:Pages>
-    <b:RefOrder>3</b:RefOrder>
-  </b:Source>
-  <b:Source>
-    <b:Tag>Kou25</b:Tag>
-    <b:SourceType>ArticleInAPeriodical</b:SourceType>
-    <b:Guid>{C393AD5F-0069-4179-8234-F93FBBB5DFB7}</b:Guid>
-    <b:Author>
-      <b:Author>
-        <b:NameList>
-          <b:Person>
-            <b:Last>Koukaras</b:Last>
-            <b:First>P.</b:First>
-            <b:Middle>and Tjortjis, C</b:Middle>
-          </b:Person>
-        </b:NameList>
-      </b:Author>
-    </b:Author>
-    <b:Title>Data Preprocessing and Feature Engineering for Data Mining: Techniques, Tools, and Best Practices</b:Title>
-    <b:PeriodicalTitle>AI</b:PeriodicalTitle>
-    <b:Year>2025</b:Year>
-    <b:Pages>6(10), article 257</b:Pages>
-    <b:RefOrder>4</b:RefOrder>
-  </b:Source>
-  <b:Source>
-    <b:Tag>Rai24</b:Tag>
-    <b:SourceType>ArticleInAPeriodical</b:SourceType>
-    <b:Guid>{785222AB-46C8-4C86-9F7A-DB716234C270}</b:Guid>
-    <b:Author>
-      <b:Author>
-        <b:NameList>
-          <b:Person>
-            <b:Last>Rainio</b:Last>
-            <b:First>O.,</b:First>
-            <b:Middle>Teuho, J. and Klén, R.</b:Middle>
-          </b:Person>
-        </b:NameList>
-      </b:Author>
-    </b:Author>
-    <b:Title>Evaluation metrics and statistical tests for machine learning</b:Title>
-    <b:PeriodicalTitle>Scientific Reports</b:PeriodicalTitle>
-    <b:Year>2024</b:Year>
-    <b:Pages>14, article 6086</b:Pages>
-    <b:RefOrder>5</b:RefOrder>
-  </b:Source>
-</b:Sources>
-</file>
-
-<file path=customXml/item5.xml><?xml version="1.0" encoding="utf-8"?>
 <ct:contentTypeSchema xmlns:ct="http://schemas.microsoft.com/office/2006/metadata/contentType" xmlns:ma="http://schemas.microsoft.com/office/2006/metadata/properties/metaAttributes" ct:_="" ma:_="" ma:contentTypeName="Document" ma:contentTypeID="0x01010091CA7052A48FB44E8BAE44044031FC77" ma:contentTypeVersion="5" ma:contentTypeDescription="Create a new document." ma:contentTypeScope="" ma:versionID="72110da391d7bf7bbbd9879cda66318c">
   <xsd:schema xmlns:xsd="http://www.w3.org/2001/XMLSchema" xmlns:xs="http://www.w3.org/2001/XMLSchema" xmlns:p="http://schemas.microsoft.com/office/2006/metadata/properties" xmlns:ns3="b16a9495-4dfd-42d3-807b-98cb11f03b43" targetNamespace="http://schemas.microsoft.com/office/2006/metadata/properties" ma:root="true" ma:fieldsID="65d4c4ab10123b5e2192ffab3149626d" ns3:_="">
     <xsd:import namespace="b16a9495-4dfd-42d3-807b-98cb11f03b43"/>
@@ -9662,42 +9749,141 @@
 </ct:contentTypeSchema>
 </file>
 
-<file path=customXml/itemProps1.xml><?xml version="1.0" encoding="utf-8"?>
-<ds:datastoreItem xmlns:ds="http://schemas.openxmlformats.org/officeDocument/2006/customXml" ds:itemID="{AD64260C-1345-4C21-A804-B9FBE7B91489}">
-  <ds:schemaRefs>
-    <ds:schemaRef ds:uri="http://schemas.microsoft.com/sharepoint/v3/contenttype/forms"/>
-  </ds:schemaRefs>
-</ds:datastoreItem>
+<file path=customXml/item2.xml><?xml version="1.0" encoding="utf-8"?>
+<b:Sources xmlns:b="http://schemas.openxmlformats.org/officeDocument/2006/bibliography" xmlns="http://schemas.openxmlformats.org/officeDocument/2006/bibliography" SelectedStyle="\HarvardAnglia2008OfficeOnline.xsl" StyleName="Harvard - Anglia" Version="2008">
+  <b:Source>
+    <b:Tag>Pat18</b:Tag>
+    <b:SourceType>ArticleInAPeriodical</b:SourceType>
+    <b:Guid>{5B52B951-322D-4CCD-8748-31433AF64BBC}</b:Guid>
+    <b:Title>Data Analytics Systems and SME type - a Design Science Approach</b:Title>
+    <b:Year>2018</b:Year>
+    <b:LCID>en-IE</b:LCID>
+    <b:Author>
+      <b:Author>
+        <b:NameList>
+          <b:Person>
+            <b:Last>Patrick ULRICH</b:Last>
+            <b:First>Wolfgang</b:First>
+            <b:Middle>BECKER, Alexandra FIBITZ, Eva REITELSHÖFER</b:Middle>
+          </b:Person>
+        </b:NameList>
+      </b:Author>
+    </b:Author>
+    <b:PeriodicalTitle>ScienceDirect</b:PeriodicalTitle>
+    <b:Pages>1162–1170</b:Pages>
+    <b:RefOrder>1</b:RefOrder>
+  </b:Source>
+  <b:Source>
+    <b:Tag>Gün19</b:Tag>
+    <b:SourceType>ArticleInAPeriodical</b:SourceType>
+    <b:Guid>{8B29ADD7-CF57-41D6-8460-C908A42EA451}</b:Guid>
+    <b:Author>
+      <b:Author>
+        <b:NameList>
+          <b:Person>
+            <b:Last>Günther</b:Last>
+            <b:First>Lisa</b:First>
+            <b:Middle>C., Colangelo, Eduardo, Wiendahl, Hans-Hermann, Bauer, Christian</b:Middle>
+          </b:Person>
+        </b:NameList>
+      </b:Author>
+    </b:Author>
+    <b:Title>Data quality assessment for improved decision-making: a methodology for small and medium-sized enterprises</b:Title>
+    <b:PeriodicalTitle>Procedia Manufacturing</b:PeriodicalTitle>
+    <b:Year>2019</b:Year>
+    <b:Pages>583–591</b:Pages>
+    <b:RefOrder>2</b:RefOrder>
+  </b:Source>
+  <b:Source>
+    <b:Tag>Ber21</b:Tag>
+    <b:SourceType>ArticleInAPeriodical</b:SourceType>
+    <b:Guid>{1F06AFAC-C1ED-469E-AF8B-13855CC9A64D}</b:Guid>
+    <b:Author>
+      <b:Author>
+        <b:NameList>
+          <b:Person>
+            <b:Last>Bernritter</b:Last>
+            <b:First>S.F.,</b:First>
+            <b:Middle>Ketelaar, P.E. and Sotgiu, F.</b:Middle>
+          </b:Person>
+        </b:NameList>
+      </b:Author>
+    </b:Author>
+    <b:Title>Behaviorally targeted location-based mobile marketing’</b:Title>
+    <b:PeriodicalTitle>Journal of the Academy of Marketing Science</b:PeriodicalTitle>
+    <b:Year>2021</b:Year>
+    <b:Pages>49:677–702</b:Pages>
+    <b:RefOrder>3</b:RefOrder>
+  </b:Source>
+  <b:Source>
+    <b:Tag>Kou25</b:Tag>
+    <b:SourceType>ArticleInAPeriodical</b:SourceType>
+    <b:Guid>{C393AD5F-0069-4179-8234-F93FBBB5DFB7}</b:Guid>
+    <b:Author>
+      <b:Author>
+        <b:NameList>
+          <b:Person>
+            <b:Last>Koukaras</b:Last>
+            <b:First>P.</b:First>
+            <b:Middle>and Tjortjis, C</b:Middle>
+          </b:Person>
+        </b:NameList>
+      </b:Author>
+    </b:Author>
+    <b:Title>Data Preprocessing and Feature Engineering for Data Mining: Techniques, Tools, and Best Practices</b:Title>
+    <b:PeriodicalTitle>AI</b:PeriodicalTitle>
+    <b:Year>2025</b:Year>
+    <b:Pages>6(10), article 257</b:Pages>
+    <b:RefOrder>4</b:RefOrder>
+  </b:Source>
+  <b:Source>
+    <b:Tag>Rai24</b:Tag>
+    <b:SourceType>ArticleInAPeriodical</b:SourceType>
+    <b:Guid>{785222AB-46C8-4C86-9F7A-DB716234C270}</b:Guid>
+    <b:Author>
+      <b:Author>
+        <b:NameList>
+          <b:Person>
+            <b:Last>Rainio</b:Last>
+            <b:First>O.,</b:First>
+            <b:Middle>Teuho, J. and Klén, R.</b:Middle>
+          </b:Person>
+        </b:NameList>
+      </b:Author>
+    </b:Author>
+    <b:Title>Evaluation metrics and statistical tests for machine learning</b:Title>
+    <b:PeriodicalTitle>Scientific Reports</b:PeriodicalTitle>
+    <b:Year>2024</b:Year>
+    <b:Pages>14, article 6086</b:Pages>
+    <b:RefOrder>5</b:RefOrder>
+  </b:Source>
+</b:Sources>
 </file>
 
-<file path=customXml/itemProps2.xml><?xml version="1.0" encoding="utf-8"?>
-<ds:datastoreItem xmlns:ds="http://schemas.openxmlformats.org/officeDocument/2006/customXml" ds:itemID="{D51EB97A-8C7A-4EE1-A3AD-E57FDBFA6BEE}">
-  <ds:schemaRefs>
-    <ds:schemaRef ds:uri="http://schemas.microsoft.com/office/2006/metadata/properties"/>
-    <ds:schemaRef ds:uri="http://schemas.microsoft.com/office/infopath/2007/PartnerControls"/>
-    <ds:schemaRef ds:uri="b16a9495-4dfd-42d3-807b-98cb11f03b43"/>
-  </ds:schemaRefs>
-</ds:datastoreItem>
+<file path=customXml/item3.xml><?xml version="1.0" encoding="utf-8"?>
+<go:gDocsCustomXmlDataStorage xmlns:go="http://customooxmlschemas.google.com/" xmlns:r="http://schemas.openxmlformats.org/officeDocument/2006/relationships" uri="GoogleDocsCustomDataVersion2">
+  <go:docsCustomData xmlns:go="http://customooxmlschemas.google.com/" roundtripDataSignature="AMtx7miehlgh2pzFvkmpnhkVaeODs3Wnuw==">CgMxLjAyCGguZ2pkZ3hzMgloLjMwajB6bGwyCWguMWZvYjl0ZTIJaC4zem55c2g3MgloLjJldDkycDAyDmgua2ZranMzcndsMmMxOAByITF6bEVRVXYyWkdtTjZWemdfYk5uaGpmb0x1c2hhYUo3dw==</go:docsCustomData>
+</go:gDocsCustomXmlDataStorage>
 </file>
 
-<file path=customXml/itemProps3.xml><?xml version="1.0" encoding="utf-8"?>
-<ds:datastoreItem xmlns:ds="http://schemas.openxmlformats.org/officeDocument/2006/customXml" ds:itemID="{11111111-1234-1234-1234-123412341234}">
-  <ds:schemaRefs>
-    <ds:schemaRef ds:uri="http://customooxmlschemas.google.com/"/>
-    <ds:schemaRef ds:uri="http://schemas.openxmlformats.org/officeDocument/2006/relationships"/>
-  </ds:schemaRefs>
-</ds:datastoreItem>
+<file path=customXml/item4.xml><?xml version="1.0" encoding="utf-8"?>
+<p:properties xmlns:p="http://schemas.microsoft.com/office/2006/metadata/properties" xmlns:xsi="http://www.w3.org/2001/XMLSchema-instance" xmlns:pc="http://schemas.microsoft.com/office/infopath/2007/PartnerControls">
+  <documentManagement>
+    <_activity xmlns="b16a9495-4dfd-42d3-807b-98cb11f03b43" xsi:nil="true"/>
+  </documentManagement>
+</p:properties>
 </file>
 
-<file path=customXml/itemProps4.xml><?xml version="1.0" encoding="utf-8"?>
-<ds:datastoreItem xmlns:ds="http://schemas.openxmlformats.org/officeDocument/2006/customXml" ds:itemID="{8C593334-F82D-4C95-8B9D-FA35DB2BF261}">
-  <ds:schemaRefs>
-    <ds:schemaRef ds:uri="http://schemas.openxmlformats.org/officeDocument/2006/bibliography"/>
-  </ds:schemaRefs>
-</ds:datastoreItem>
+<file path=customXml/item5.xml><?xml version="1.0" encoding="utf-8"?>
+<?mso-contentType ?>
+<FormTemplates xmlns="http://schemas.microsoft.com/sharepoint/v3/contenttype/forms">
+  <Display>DocumentLibraryForm</Display>
+  <Edit>DocumentLibraryForm</Edit>
+  <New>DocumentLibraryForm</New>
+</FormTemplates>
 </file>
 
-<file path=customXml/itemProps5.xml><?xml version="1.0" encoding="utf-8"?>
+<file path=customXml/itemProps1.xml><?xml version="1.0" encoding="utf-8"?>
 <ds:datastoreItem xmlns:ds="http://schemas.openxmlformats.org/officeDocument/2006/customXml" ds:itemID="{1CD39011-2B34-4226-8638-59B13D86301D}">
   <ds:schemaRefs>
     <ds:schemaRef ds:uri="http://schemas.microsoft.com/office/2006/metadata/contentType"/>
@@ -9713,4 +9899,39 @@
     <ds:schemaRef ds:uri="http://schemas.microsoft.com/internal/obd"/>
   </ds:schemaRefs>
 </ds:datastoreItem>
+</file>
+
+<file path=customXml/itemProps2.xml><?xml version="1.0" encoding="utf-8"?>
+<ds:datastoreItem xmlns:ds="http://schemas.openxmlformats.org/officeDocument/2006/customXml" ds:itemID="{8C593334-F82D-4C95-8B9D-FA35DB2BF261}">
+  <ds:schemaRefs>
+    <ds:schemaRef ds:uri="http://schemas.openxmlformats.org/officeDocument/2006/bibliography"/>
+  </ds:schemaRefs>
+</ds:datastoreItem>
+</file>
+
+<file path=customXml/itemProps3.xml><?xml version="1.0" encoding="utf-8"?>
+<ds:datastoreItem xmlns:ds="http://schemas.openxmlformats.org/officeDocument/2006/customXml" ds:itemID="{11111111-1234-1234-1234-123412341234}">
+  <ds:schemaRefs>
+    <ds:schemaRef ds:uri="http://customooxmlschemas.google.com/"/>
+    <ds:schemaRef ds:uri="http://schemas.openxmlformats.org/officeDocument/2006/relationships"/>
+  </ds:schemaRefs>
+</ds:datastoreItem>
+</file>
+
+<file path=customXml/itemProps4.xml><?xml version="1.0" encoding="utf-8"?>
+<ds:datastoreItem xmlns:ds="http://schemas.openxmlformats.org/officeDocument/2006/customXml" ds:itemID="{D51EB97A-8C7A-4EE1-A3AD-E57FDBFA6BEE}">
+  <ds:schemaRefs>
+    <ds:schemaRef ds:uri="http://schemas.microsoft.com/office/2006/metadata/properties"/>
+    <ds:schemaRef ds:uri="http://schemas.microsoft.com/office/infopath/2007/PartnerControls"/>
+    <ds:schemaRef ds:uri="b16a9495-4dfd-42d3-807b-98cb11f03b43"/>
+  </ds:schemaRefs>
+</ds:datastoreItem>
+</file>
+
+<file path=customXml/itemProps5.xml><?xml version="1.0" encoding="utf-8"?>
+<ds:datastoreItem xmlns:ds="http://schemas.openxmlformats.org/officeDocument/2006/customXml" ds:itemID="{AD64260C-1345-4C21-A804-B9FBE7B91489}">
+  <ds:schemaRefs>
+    <ds:schemaRef ds:uri="http://schemas.microsoft.com/sharepoint/v3/contenttype/forms"/>
+  </ds:schemaRefs>
+</ds:datastoreItem>
 </file>
</xml_diff>